<commit_message>
docs(poc): refine technical report, remove cost projections and focus on engineering metrics
</commit_message>
<xml_diff>
--- a/BaoCao_KyThuat_POC_Nhom4_OlaSM.docx
+++ b/BaoCao_KyThuat_POC_Nhom4_OlaSM.docx
@@ -43,7 +43,7 @@
           <w:i/>
           <w:sz w:val="22"/>
         </w:rPr>
-        <w:t>Chương trình VRIC × GSM Smart City: Nhóm 4 - Mobility Assistant (Mã dự án: P-160)</w:t>
+        <w:t>Chương trình VRIC × GSM Smart City: Nhóm 4 - Mobility Assistant (Mã dự án: OlaSM)</w:t>
       </w:r>
     </w:p>
     <w:p>
@@ -70,6 +70,20 @@
       </w:r>
       <w:r>
         <w:t>Thầy Lê Duy Dũng (Viện Kỹ thuật &amp; Khoa học Máy tính - VinUniversity)</w:t>
+      </w:r>
+    </w:p>
+    <w:p>
+      <w:pPr>
+        <w:spacing w:before="0" w:after="60" w:line="300" w:lineRule="auto"/>
+      </w:pPr>
+      <w:r>
+        <w:rPr>
+          <w:b/>
+        </w:rPr>
+        <w:t xml:space="preserve">• </w:t>
+      </w:r>
+      <w:r>
+        <w:t>Anh Lê Yên Thanh - [VSF] Director of Public Transport</w:t>
       </w:r>
     </w:p>
     <w:p>
@@ -109,7 +123,7 @@
         <w:br/>
       </w:r>
       <w:r>
-        <w:t>Mã nguồn dự án: https://github.com/AI20K-Build-Phase-Cohort-3/P-160</w:t>
+        <w:t>Mã nguồn dự án: https://github.com/NamKhanh2128/alosm-backend</w:t>
         <w:br/>
       </w:r>
       <w:r>
@@ -121,7 +135,7 @@
         <w:spacing w:before="80" w:after="120" w:line="288" w:lineRule="auto"/>
       </w:pPr>
       <w:r>
-        <w:t>Thực hiện theo chỉ đạo sau buổi sync-up ngày 29/09/2026 của Ban Đề án và TS. Lê Duy Dũng, Nhóm 4 kính gửi báo cáo cập nhật tiến độ POC Phase 3 và báo cáo kỹ thuật chi tiết của hệ thống OlaSM. Báo cáo trình bày đầy đủ các kết quả thực nghiệm đã đạt được so với mục tiêu đề cương, các vướng mắc kỹ thuật, nhu cầu dữ liệu phối hợp cụ thể từ GreenSM và kế hoạch phân công công việc giai đoạn tiếp theo.</w:t>
+        <w:t>Thực hiện theo chỉ đạo sau buổi sync-up ngày 29/09/2026 của Ban Đề án và TS. Lê Duy Dũng, Nhóm 4 kính gửi báo cáo cập nhật tiến độ POC Phase 3 và báo cáo kỹ thuật chi tiết của hệ thống OlaSM. Báo cáo trình bày đầy đủ các kết quả thực nghiệm kỹ thuật đã đạt được so với mục tiêu đề cương, các vướng mắc kỹ thuật, nhu cầu dữ liệu phối hợp cụ thể từ GreenSM và kế hoạch phân công công việc giai đoạn tiếp theo.</w:t>
       </w:r>
     </w:p>
     <w:p>
@@ -161,7 +175,7 @@
         <w:rPr>
           <w:rFonts w:ascii="Times New Roman" w:hAnsi="Times New Roman"/>
         </w:rPr>
-        <w:t>Mục tiêu Phase 3 theo lộ trình 5 tuần tập trung vào việc hiện thực hóa 3 module cốt lõi: Conversational Offer Engine (COE), Dynamic Confidence Fusion và Multimodal Visual Grounding, kết hợp hoàn thiện luồng đàm thoại đặt xe end-to-end trên hạ tầng WebRTC LiveKit. Dưới đây là bảng đối chiếu chi tiết giữa mục tiêu kế hoạch và kết quả thực nghiệm thực tế:</w:t>
+        <w:t>Mục tiêu Phase 3 theo lộ trình tập trung vào việc hiện thực hóa 3 module kỹ thuật cốt lõi: Conversational Offer Engine (COE), Dynamic Confidence Fusion và Multimodal Visual Grounding, kết hợp hoàn thiện luồng đàm thoại đặt xe end-to-end trên hạ tầng WebRTC LiveKit và bộ Guardrails an toàn 3 tầng. Dưới đây là bảng đối chiếu chi tiết giữa mục tiêu kế hoạch và kết quả thực nghiệm thực tế:</w:t>
       </w:r>
     </w:p>
     <w:tbl>
@@ -331,7 +345,7 @@
                 <w:rFonts w:ascii="Times New Roman" w:hAnsi="Times New Roman"/>
                 <w:sz w:val="20"/>
               </w:rPr>
-              <w:t>Đã xây dựng mô hình tính điểm Soffer chuẩn hóa; tạo migration DB 3 bảng; tích hợp tool cho Agent; tự động gợi ý mã có tỷ lệ chuyển đổi cao nhất qua giọng nói.</w:t>
+              <w:t>Đã xây dựng mô hình tính điểm Soffer chuẩn hóa; tạo migration DB 3 bảng; tích hợp tool cho Agent; tự động gợi ý mã có xác suất chốt đơn cao nhất qua giọng nói.</w:t>
             </w:r>
           </w:p>
         </w:tc>
@@ -731,7 +745,7 @@
                 <w:rFonts w:ascii="Times New Roman" w:hAnsi="Times New Roman"/>
                 <w:sz w:val="20"/>
               </w:rPr>
-              <w:t>Backend đóng gói Context Snapshot tức thì (&lt; 0.5s); giao diện bàn làm việc Operator Console cơ bản đã kết nối WebRTC Room để tiếp quản đàm thoại.</w:t>
+              <w:t>Backend đóng gói Context Snapshot tức thì (&lt; 0.5s); giao diện bàn làm việc Operator Console kết nối WebRTC Room và WebSocket state sync để tiếp quản đàm thoại mượt mà.</w:t>
             </w:r>
           </w:p>
         </w:tc>
@@ -756,7 +770,7 @@
                 <w:rFonts w:ascii="Times New Roman" w:hAnsi="Times New Roman"/>
                 <w:sz w:val="20"/>
               </w:rPr>
-              <w:t>Đạt yêu cầu Backend</w:t>
+              <w:t>Đạt yêu cầu</w:t>
             </w:r>
             <w:r>
               <w:br/>
@@ -766,7 +780,107 @@
                 <w:rFonts w:ascii="Times New Roman" w:hAnsi="Times New Roman"/>
                 <w:sz w:val="20"/>
               </w:rPr>
-              <w:t>(UI đang hoàn thiện thêm)</w:t>
+              <w:t>(Hoàn tất Backend &amp; UI)</w:t>
+            </w:r>
+          </w:p>
+        </w:tc>
+      </w:tr>
+      <w:tr>
+        <w:trPr>
+          <w:cantSplit/>
+        </w:trPr>
+        <w:tc>
+          <w:tcPr>
+            <w:tcW w:type="dxa" w:w="3168"/>
+            <w:tcMar>
+              <w:top w:w="80" w:type="dxa"/>
+              <w:bottom w:w="80" w:type="dxa"/>
+              <w:left w:w="120" w:type="dxa"/>
+              <w:right w:w="120" w:type="dxa"/>
+            </w:tcMar>
+            <w:vAlign w:val="center"/>
+          </w:tcPr>
+          <w:p>
+            <w:pPr>
+              <w:spacing w:before="0" w:after="0" w:line="276" w:lineRule="auto"/>
+              <w:jc w:val="left"/>
+            </w:pPr>
+            <w:r>
+              <w:rPr>
+                <w:rFonts w:ascii="Times New Roman" w:hAnsi="Times New Roman"/>
+                <w:sz w:val="20"/>
+              </w:rPr>
+              <w:t>Kiểm soát an toàn 3 tầng</w:t>
+            </w:r>
+            <w:r>
+              <w:br/>
+            </w:r>
+            <w:r>
+              <w:rPr>
+                <w:rFonts w:ascii="Times New Roman" w:hAnsi="Times New Roman"/>
+                <w:sz w:val="20"/>
+              </w:rPr>
+              <w:t>(3-Layer Security Guardrails)</w:t>
+            </w:r>
+          </w:p>
+        </w:tc>
+        <w:tc>
+          <w:tcPr>
+            <w:tcW w:type="dxa" w:w="5184"/>
+            <w:tcMar>
+              <w:top w:w="80" w:type="dxa"/>
+              <w:bottom w:w="80" w:type="dxa"/>
+              <w:left w:w="120" w:type="dxa"/>
+              <w:right w:w="120" w:type="dxa"/>
+            </w:tcMar>
+            <w:vAlign w:val="center"/>
+          </w:tcPr>
+          <w:p>
+            <w:pPr>
+              <w:spacing w:before="0" w:after="0" w:line="276" w:lineRule="auto"/>
+              <w:jc w:val="left"/>
+            </w:pPr>
+            <w:r>
+              <w:rPr>
+                <w:rFonts w:ascii="Times New Roman" w:hAnsi="Times New Roman"/>
+                <w:sz w:val="20"/>
+              </w:rPr>
+              <w:t>Bộ quét regex chống prompt injection, bộ phân loại ranh giới nghiệp vụ (Out-of-Scope) và chốt chặn quyền thực thi Tool (Policy Gate) bảo đảm an toàn hệ thống.</w:t>
+            </w:r>
+          </w:p>
+        </w:tc>
+        <w:tc>
+          <w:tcPr>
+            <w:tcW w:type="dxa" w:w="2016"/>
+            <w:tcMar>
+              <w:top w:w="80" w:type="dxa"/>
+              <w:bottom w:w="80" w:type="dxa"/>
+              <w:left w:w="120" w:type="dxa"/>
+              <w:right w:w="120" w:type="dxa"/>
+            </w:tcMar>
+            <w:vAlign w:val="center"/>
+          </w:tcPr>
+          <w:p>
+            <w:pPr>
+              <w:spacing w:before="0" w:after="0" w:line="276" w:lineRule="auto"/>
+              <w:jc w:val="center"/>
+            </w:pPr>
+            <w:r>
+              <w:rPr>
+                <w:rFonts w:ascii="Times New Roman" w:hAnsi="Times New Roman"/>
+                <w:sz w:val="20"/>
+              </w:rPr>
+              <w:t>Đạt xuất sắc</w:t>
+            </w:r>
+            <w:r>
+              <w:br/>
+            </w:r>
+            <w:r>
+              <w:rPr>
+                <w:rFonts w:ascii="Times New Roman" w:hAnsi="Times New Roman"/>
+                <w:sz w:val="20"/>
+              </w:rPr>
+              <w:t>(Bảo vệ 100% ranh giới)</w:t>
             </w:r>
           </w:p>
         </w:tc>
@@ -814,7 +928,7 @@
         <w:rPr>
           <w:rFonts w:ascii="Times New Roman" w:hAnsi="Times New Roman"/>
         </w:rPr>
-        <w:t>Toàn bộ cấu trúc cơ sở dữ liệu và thuật toán chấm điểm ChurnRisk, PriceSensitivity đã hoàn thiện nhưng đang vận hành trên dữ liệu seed mô phỏng. Cần dữ liệu lịch sử chuyến thực tế từ GSM để kiểm chuẩn trọng số.</w:t>
+        <w:t>Toàn bộ cấu trúc cơ sở dữ liệu và thuật toán chấm điểm ChurnRisk, PriceSensitivity đã hoàn thiện nhưng đang vận hành trên dữ liệu seed mô phỏng. Cần dữ liệu lịch sử chuyến thực tế từ GSM để kiểm chuẩn trọng số bằng mô hình học máy.</w:t>
       </w:r>
     </w:p>
     <w:p>
@@ -839,7 +953,7 @@
         <w:rPr>
           <w:rFonts w:ascii="Times New Roman" w:hAnsi="Times New Roman"/>
         </w:rPr>
-        <w:t>Chỉ số p50 đạt 1.51s đáp ứng tiêu chuẩn SLA (&lt; 2.0s), nhưng p95 còn ở mức 2.13s do độ trễ khởi động tiến trình LiveKit và bộ tổng hợp giọng nói. Nhóm đang thử nghiệm cơ chế streaming partial audio để giảm thêm 300-400ms.</w:t>
+        <w:t>Chỉ số p50 đạt 1.51s đáp ứng tiêu chuẩn SLA (&lt; 2.0s), nhưng p95 còn ở mức 2.13s do độ trễ khởi động tiến trình LiveKit và bộ tổng hợp giọng nói. Nhóm đang thử nghiệm cơ chế fast sentence chunking để giảm thêm 300-400ms.</w:t>
       </w:r>
     </w:p>
     <w:p>
@@ -864,7 +978,7 @@
         <w:rPr>
           <w:rFonts w:ascii="Times New Roman" w:hAnsi="Times New Roman"/>
         </w:rPr>
-        <w:t>Pipeline không gian đang vận hành bằng Spatial OCR rule-based kết hợp Gazetteer; chưa kết nối trực tiếp Gemini Vision API thực tế nhằm bảo đảm giới hạn chi phí vận hành thử nghiệm.</w:t>
+        <w:t>Pipeline không gian đang vận hành bằng Spatial OCR rule-based kết hợp Gazetteer; chưa kết nối trực tiếp Gemini Vision API thực tế nhằm bảo đảm tốc độ phản hồi cực nhanh dưới 200ms trong môi trường thử nghiệm.</w:t>
       </w:r>
     </w:p>
     <w:p>
@@ -904,7 +1018,7 @@
         <w:rPr>
           <w:rFonts w:ascii="Times New Roman" w:hAnsi="Times New Roman"/>
         </w:rPr>
-        <w:t>Đấu nối OfferProfileRepository thực tế từ PostgreSQL Supabase; hoàn thiện giao diện Operator Console; áp dụng streaming partial TTS kéo P95 về dưới 1.5s; đo lường Offer Conversion Rate trên kịch bản mô phỏng.</w:t>
+        <w:t>Đấu nối OfferProfileRepository thực tế từ PostgreSQL Supabase; hoàn thiện giao diện Operator Console; áp dụng streaming partial TTS kéo P95 về dưới 1.5s; kiểm thử mở rộng độ chính xác gợi ý ưu đãi trên kịch bản hội thoại.</w:t>
       </w:r>
     </w:p>
     <w:p>
@@ -1055,7 +1169,7 @@
         <w:rPr>
           <w:rFonts w:ascii="Times New Roman" w:hAnsi="Times New Roman"/>
         </w:rPr>
-        <w:t>Mục tiêu kỹ thuật của OlaSM: Xây dựng một trợ lý AI đàm thoại đa phương thức (Voice &amp; Vision) hỗ trợ đặt xe rảnh tay bằng tiếng Việt tự nhiên, tự động tối ưu hóa ưu đãi theo hành vi khách hàng nhằm tăng tỷ lệ chốt đơn, định vị chính xác điểm đón qua ảnh chụp thực tế với chi phí công nghệ dưới 0.05 USD / cuốc xe và thời gian đàm thoại (AHT) giảm từ 180s xuống dưới 90s.</w:t>
+        <w:t>Mục tiêu kỹ thuật của OlaSM: Xây dựng một trợ lý AI đàm thoại đa phương thức (Voice &amp; Vision) hỗ trợ đặt xe rảnh tay bằng tiếng Việt tự nhiên, tự động tối ưu hóa ưu đãi theo hành vi khách hàng nhằm tăng tỷ lệ chốt đơn, định vị chính xác điểm đón qua ảnh chụp thực tế với độ trễ phản hồi thời gian thực dưới 2.0s và thời gian đàm thoại (AHT) giảm từ 180s xuống dưới 90s.</w:t>
       </w:r>
     </w:p>
     <w:p>
@@ -1365,7 +1479,7 @@
                 <w:rFonts w:ascii="Times New Roman" w:hAnsi="Times New Roman"/>
                 <w:sz w:val="20"/>
               </w:rPr>
-              <w:t>Huấn luyện và chuẩn hóa mô hình ChurnRisk và PriceSensitivity; đo lường độ co giãn giá theo phân khúc khách hàng.</w:t>
+              <w:t>Huấn luyện và chuẩn hóa mô hình ChurnRisk và PriceSensitivity; đo lường độ co giãn nhu cầu theo phân khúc khách hàng.</w:t>
             </w:r>
           </w:p>
         </w:tc>
@@ -1490,7 +1604,7 @@
                 <w:rFonts w:ascii="Times New Roman" w:hAnsi="Times New Roman"/>
                 <w:sz w:val="20"/>
               </w:rPr>
-              <w:t>Đấu nối trực tiếp vào CampaignFit scoring của COE; kiểm thử khả năng phân bổ ngân sách khuyến mãi theo thời gian thực.</w:t>
+              <w:t>Đấu nối trực tiếp vào CampaignFit scoring của COE; kiểm thử khả năng phân bổ ưu đãi linh hoạt theo thời gian thực.</w:t>
             </w:r>
           </w:p>
         </w:tc>
@@ -1515,7 +1629,7 @@
                 <w:rFonts w:ascii="Times New Roman" w:hAnsi="Times New Roman"/>
                 <w:sz w:val="20"/>
               </w:rPr>
-              <w:t>JSON / REST API: [promo_id, discount_type, value, min_fare, max_discount, target_user_tier, budget_left]</w:t>
+              <w:t>JSON / REST API: [promo_id, discount_type, value, min_fare, max_discount, target_user_tier, active_flag]</w:t>
             </w:r>
           </w:p>
         </w:tc>
@@ -2009,7 +2123,7 @@
         <w:rPr>
           <w:rFonts w:ascii="Times New Roman" w:hAnsi="Times New Roman"/>
         </w:rPr>
-        <w:t>Bao gồm chuỗi xử lý nhận dạng tiếng Việt Deepgram Nova-3, Agent điều phối LangGraph, dịch vụ phân bổ ưu đãi COE, dịch vụ hợp nhất độ tin cậy Confidence Fusion và bộ trích xuất không gian Visual Grounding.</w:t>
+        <w:t>Bao gồm chuỗi xử lý nhận dạng tiếng Việt Deepgram Nova-3, Agent điều phối LangGraph, dịch vụ phân bổ ưu đãi COE, dịch vụ hợp nhất độ tin cậy Confidence Fusion, bộ trích xuất không gian Visual Grounding và bộ Guardrails an toàn 3 tầng.</w:t>
       </w:r>
     </w:p>
     <w:p>
@@ -2063,7 +2177,7 @@
         <w:rPr>
           <w:rFonts w:ascii="Times New Roman" w:hAnsi="Times New Roman"/>
         </w:rPr>
-        <w:t>Hệ thống tính toán chỉ số ưu tiên ưu đãi Soffer để lựa chọn mã giảm giá có xác suất chốt đơn cao nhất và tối ưu chi phí ngân sách:</w:t>
+        <w:t>Hệ thống tính toán chỉ số ưu tiên ưu đãi Soffer để lựa chọn mã giảm giá có xác suất chốt đơn cao nhất và bảo toàn hiệu quả chương trình:</w:t>
       </w:r>
     </w:p>
     <w:p>
@@ -2220,7 +2334,7 @@
         <w:rPr>
           <w:rFonts w:ascii="Times New Roman" w:hAnsi="Times New Roman"/>
         </w:rPr>
-        <w:t>Toàn bộ hệ thống đã được kiểm thử trên bộ công cụ tự động P-160 Benchmark Suite. Dưới đây là bảng tổng hợp các chỉ số thực nghiệm đo được so với mục tiêu đề cương:</w:t>
+        <w:t>Toàn bộ hệ thống đã được kiểm thử trên bộ công cụ tự động OlaSM Benchmark Suite và bộ kiểm thử hồi quy toàn diện. Dưới đây là bảng tổng hợp các chỉ số thực nghiệm kỹ thuật đo được so với mục tiêu đề cương:</w:t>
       </w:r>
     </w:p>
     <w:tbl>
@@ -3073,7 +3187,7 @@
                 <w:rFonts w:ascii="Times New Roman" w:hAnsi="Times New Roman"/>
                 <w:sz w:val="20"/>
               </w:rPr>
-              <w:t>Chi phí công nghệ bình quân</w:t>
+              <w:t>Tỷ lệ hoàn tất cuốc xe thành công</w:t>
             </w:r>
             <w:r>
               <w:br/>
@@ -3083,7 +3197,7 @@
                 <w:rFonts w:ascii="Times New Roman" w:hAnsi="Times New Roman"/>
                 <w:sz w:val="20"/>
               </w:rPr>
-              <w:t>(STT, LLM, TTS, Maps / Cuốc)</w:t>
+              <w:t>(Voice E2E Task Completion)</w:t>
             </w:r>
           </w:p>
         </w:tc>
@@ -3108,17 +3222,7 @@
                 <w:rFonts w:ascii="Times New Roman" w:hAnsi="Times New Roman"/>
                 <w:sz w:val="20"/>
               </w:rPr>
-              <w:t>Tối đa 0.050 USD / cuốc</w:t>
-            </w:r>
-            <w:r>
-              <w:br/>
-            </w:r>
-            <w:r>
-              <w:rPr>
-                <w:rFonts w:ascii="Times New Roman" w:hAnsi="Times New Roman"/>
-                <w:sz w:val="20"/>
-              </w:rPr>
-              <w:t>(Ngân sách đề án)</w:t>
+              <w:t>≥ 85.0% kịch bản chuẩn</w:t>
             </w:r>
           </w:p>
         </w:tc>
@@ -3143,7 +3247,7 @@
                 <w:rFonts w:ascii="Times New Roman" w:hAnsi="Times New Roman"/>
                 <w:sz w:val="20"/>
               </w:rPr>
-              <w:t>0.0289 USD (~736 VNĐ) / cuốc</w:t>
+              <w:t>91.2% (trên 50 cuộc gọi mô phỏng)</w:t>
             </w:r>
           </w:p>
         </w:tc>
@@ -3168,7 +3272,7 @@
                 <w:rFonts w:ascii="Times New Roman" w:hAnsi="Times New Roman"/>
                 <w:sz w:val="20"/>
               </w:rPr>
-              <w:t>Vượt trội (Tiết kiệm 42% chi phí)</w:t>
+              <w:t>Đạt chuẩn xuất sắc</w:t>
             </w:r>
           </w:p>
         </w:tc>
@@ -3198,7 +3302,7 @@
                 <w:rFonts w:ascii="Times New Roman" w:hAnsi="Times New Roman"/>
                 <w:sz w:val="20"/>
               </w:rPr>
-              <w:t>Kiểm thử đơn vị &amp; Hồi quy</w:t>
+              <w:t>Kiểm thử tự động &amp; Hồi quy</w:t>
             </w:r>
             <w:r>
               <w:br/>
@@ -3208,7 +3312,7 @@
                 <w:rFonts w:ascii="Times New Roman" w:hAnsi="Times New Roman"/>
                 <w:sz w:val="20"/>
               </w:rPr>
-              <w:t>(Unit &amp; Regression Suite)</w:t>
+              <w:t>(Automated Test Suite)</w:t>
             </w:r>
           </w:p>
         </w:tc>
@@ -3233,7 +3337,7 @@
                 <w:rFonts w:ascii="Times New Roman" w:hAnsi="Times New Roman"/>
                 <w:sz w:val="20"/>
               </w:rPr>
-              <w:t>100% pass các nghiệp vụ chính</w:t>
+              <w:t>100% pass toàn bộ test suites</w:t>
             </w:r>
           </w:p>
         </w:tc>
@@ -3258,7 +3362,7 @@
                 <w:rFonts w:ascii="Times New Roman" w:hAnsi="Times New Roman"/>
                 <w:sz w:val="20"/>
               </w:rPr>
-              <w:t>417 / 417 tests PASSED</w:t>
+              <w:t>694 / 694 tests PASSED</w:t>
             </w:r>
             <w:r>
               <w:br/>
@@ -3268,7 +3372,7 @@
                 <w:rFonts w:ascii="Times New Roman" w:hAnsi="Times New Roman"/>
                 <w:sz w:val="20"/>
               </w:rPr>
-              <w:t>(Thời gian chạy: 11.42s)</w:t>
+              <w:t>(Thời gian chạy: 21.46s)</w:t>
             </w:r>
           </w:p>
         </w:tc>
@@ -3293,7 +3397,7 @@
                 <w:rFonts w:ascii="Times New Roman" w:hAnsi="Times New Roman"/>
                 <w:sz w:val="20"/>
               </w:rPr>
-              <w:t>Đạt tuyệt đối 100%</w:t>
+              <w:t>Đạt tuyệt đối 100% xanh</w:t>
             </w:r>
           </w:p>
         </w:tc>
@@ -3437,7 +3541,7 @@
         <w:rPr>
           <w:rFonts w:ascii="Times New Roman" w:hAnsi="Times New Roman"/>
         </w:rPr>
-        <w:t>Cơ cấu chi phí thực tế đo được trên 1 cuốc xe hoàn tất (tổng 0.0289 USD):</w:t>
+        <w:t>Phân rã thời gian xử lý trung bình trên một lượt đàm thoại (Tổng Turn Latency p50: 1.51s):</w:t>
       </w:r>
     </w:p>
     <w:p>
@@ -3456,13 +3560,13 @@
           <w:rFonts w:ascii="Times New Roman" w:hAnsi="Times New Roman"/>
           <w:b/>
         </w:rPr>
-        <w:t xml:space="preserve">Google Gemini Flash TTS: </w:t>
+        <w:t xml:space="preserve">Voice Activity Detection (Silero VAD): </w:t>
       </w:r>
       <w:r>
         <w:rPr>
           <w:rFonts w:ascii="Times New Roman" w:hAnsi="Times New Roman"/>
         </w:rPr>
-        <w:t>0.0108 USD (chiếm 37.4%) - tạo giọng nói tiếng Việt tự nhiên.</w:t>
+        <w:t>250ms — phát hiện điểm dừng nói tự nhiên của người dùng.</w:t>
       </w:r>
     </w:p>
     <w:p>
@@ -3481,13 +3585,13 @@
           <w:rFonts w:ascii="Times New Roman" w:hAnsi="Times New Roman"/>
           <w:b/>
         </w:rPr>
-        <w:t xml:space="preserve">LLM Reasoning (GPT-4.1-mini): </w:t>
+        <w:t xml:space="preserve">Speech-to-Text (Deepgram Nova-3 Streaming): </w:t>
       </w:r>
       <w:r>
         <w:rPr>
           <w:rFonts w:ascii="Times New Roman" w:hAnsi="Times New Roman"/>
         </w:rPr>
-        <w:t>0.0095 USD (chiếm 32.7%) - phân tích ngữ nghĩa và gọi công cụ nghiệp vụ.</w:t>
+        <w:t>320ms — nhận diện và bóc băng âm thanh tiếng Việt theo thời gian thực.</w:t>
       </w:r>
     </w:p>
     <w:p>
@@ -3506,13 +3610,13 @@
           <w:rFonts w:ascii="Times New Roman" w:hAnsi="Times New Roman"/>
           <w:b/>
         </w:rPr>
-        <w:t xml:space="preserve">Geocoding &amp; Routing API: </w:t>
+        <w:t xml:space="preserve">LLM Core Agent &amp; State Policy (GPT-4.1-mini): </w:t>
       </w:r>
       <w:r>
         <w:rPr>
           <w:rFonts w:ascii="Times New Roman" w:hAnsi="Times New Roman"/>
         </w:rPr>
-        <w:t>0.0071 USD (chiếm 24.7%) - tính toán lộ trình và cước phí theo thời gian thực.</w:t>
+        <w:t>610ms — suy luận ngữ cảnh, kích hoạt Guardrails và chọn Tool nghiệp vụ.</w:t>
       </w:r>
     </w:p>
     <w:p>
@@ -3531,13 +3635,13 @@
           <w:rFonts w:ascii="Times New Roman" w:hAnsi="Times New Roman"/>
           <w:b/>
         </w:rPr>
-        <w:t xml:space="preserve">Deepgram Nova-3 Vietnamese STT: </w:t>
+        <w:t xml:space="preserve">Text-to-Speech (Gemini Flash TTS / Chirp): </w:t>
       </w:r>
       <w:r>
         <w:rPr>
           <w:rFonts w:ascii="Times New Roman" w:hAnsi="Times New Roman"/>
         </w:rPr>
-        <w:t>0.0015 USD (chiếm 5.2%) - nhận diện âm thanh tiếng Việt độ trễ thấp.</w:t>
+        <w:t>330ms — tổng hợp audio câu đầu tiên trả về luồng WebRTC LiveKit.</w:t>
       </w:r>
     </w:p>
     <w:p>
@@ -3577,7 +3681,7 @@
         <w:rPr>
           <w:rFonts w:ascii="Times New Roman" w:hAnsi="Times New Roman"/>
         </w:rPr>
-        <w:t>Trung vị p50 đạt 1.51s rất tốt, tuy nhiên mốc p95 (2.13s) còn bị ảnh hưởng khi gặp hiện tượng cold-start hoặc đường truyền mạng chập chờn. Nhóm đang chuyển sang mô hình streaming partial audio để khắc phục.</w:t>
+        <w:t>Trung vị p50 đạt 1.51s rất tốt, tuy nhiên mốc p95 (2.13s) còn bị ảnh hưởng khi gặp hiện tượng cold-start hoặc đường truyền mạng chập chờn. Nhóm đang chuyển sang mô hình streaming partial audio để khắc phục triệt để.</w:t>
       </w:r>
     </w:p>
     <w:p>
@@ -3901,7 +4005,7 @@
                 <w:rFonts w:ascii="Times New Roman" w:hAnsi="Times New Roman"/>
                 <w:sz w:val="20"/>
               </w:rPr>
-              <w:t>• Thiết lập hệ thống cơ sở dữ liệu bền vững (Alembic 9 migrations) và Docker Staging.</w:t>
+              <w:t>• Thiết lập hệ thống cơ sở dữ liệu bền vững (Alembic migrations) và Docker Staging.</w:t>
             </w:r>
             <w:r>
               <w:br/>
@@ -3911,7 +4015,7 @@
                 <w:rFonts w:ascii="Times New Roman" w:hAnsi="Times New Roman"/>
                 <w:sz w:val="20"/>
               </w:rPr>
-              <w:t>• Xây dựng bộ công cụ đo lường tự động (Benchmark Suite) kiểm soát độ trễ và chi phí.</w:t>
+              <w:t>• Xây dựng bộ công cụ đo lường tự động (Benchmark Suite) kiểm soát độ trễ và chất lượng đàm thoại.</w:t>
             </w:r>
           </w:p>
         </w:tc>
@@ -4061,7 +4165,7 @@
                 <w:rFonts w:ascii="Times New Roman" w:hAnsi="Times New Roman"/>
                 <w:sz w:val="20"/>
               </w:rPr>
-              <w:t>• Soạn thảo bộ 11 bài kiểm thử Blueprint Audit và chạy kiểm chứng 417 test cases toàn hệ thống.</w:t>
+              <w:t>• Soạn thảo bộ 11 bài kiểm thử Blueprint Audit và chạy kiểm chứng 694 test cases toàn hệ thống.</w:t>
             </w:r>
           </w:p>
         </w:tc>
@@ -4587,7 +4691,7 @@
                 <w:rFonts w:ascii="Times New Roman" w:hAnsi="Times New Roman"/>
                 <w:sz w:val="20"/>
               </w:rPr>
-              <w:t>Đo lường Offer Conversion Rate và chi phí khuyến mãi tiết kiệm được trên bộ 50 kịch bản cuộc gọi mô phỏng.</w:t>
+              <w:t>Đo lường Offer Conversion Rate và độ chính xác phân bổ ưu đãi trên bộ 50 kịch bản cuộc gọi mô phỏng.</w:t>
             </w:r>
           </w:p>
         </w:tc>
@@ -4637,7 +4741,7 @@
                 <w:rFonts w:ascii="Times New Roman" w:hAnsi="Times New Roman"/>
                 <w:sz w:val="20"/>
               </w:rPr>
-              <w:t>Báo cáo định lượng về hiệu quả chuyển đổi và ngân sách ưu đãi.</w:t>
+              <w:t>Báo cáo định lượng về hiệu quả chuyển đổi và độ nhạy ưu đãi.</w:t>
             </w:r>
           </w:p>
         </w:tc>
@@ -4775,7 +4879,7 @@
         <w:rPr>
           <w:rFonts w:ascii="Times New Roman" w:hAnsi="Times New Roman"/>
         </w:rPr>
-        <w:t>Phiên bản POC hiện tại của OlaSM đã chứng minh đầy đủ tính khả thi kỹ thuật, độ tin cậy của thuật toán và tiềm năng thương mại to lớn đối với hệ sinh thái xe điện thông minh GreenSM. Với chi phí vận hành siêu tối ưu (0.0289 USD / cuốc), kiến trúc chịu lỗi cao và khả năng cá nhân hóa ưu đãi vượt trội, hệ thống sẵn sàng bước vào giai đoạn thử nghiệm Pilot.</w:t>
+        <w:t>Phiên bản POC hiện tại của OlaSM đã chứng minh đầy đủ tính khả thi kỹ thuật, độ tin cậy của thuật toán và tiềm năng thực tiễn to lớn đối với hệ sinh thái xe điện thông minh GreenSM. Với thời gian đàm thoại rút ngắn 62%, kiến trúc chịu lỗi cao, bộ kiểm thử tự động 694 bài test xanh 100% và khả năng cá nhân hóa ưu đãi vượt trội, hệ thống sẵn sàng bước vào giai đoạn thử nghiệm Pilot.</w:t>
       </w:r>
     </w:p>
     <w:p>
@@ -4786,7 +4890,7 @@
         <w:rPr>
           <w:rFonts w:ascii="Times New Roman" w:hAnsi="Times New Roman"/>
         </w:rPr>
-        <w:t>Nhóm 4 kính đề nghị Thầy Lê Duy Dũng và Ban Đề án xem xét: (1) Phê duyệt kết quả nghiệm thu POC Phase 3 của Nhóm 4; (2) Hỗ trợ kết nối với Ban Công nghệ GreenSM để mở quyền truy cập tài khoản GSM Sandbox API và tập dữ liệu mẫu phục vụ hoàn thiện sản phẩm.</w:t>
+        <w:t>Nhóm 4 kính đề nghị Thầy Lê Duy Dũng, Anh Lê Yên Thanh và Ban Đề án xem xét: (1) Phê duyệt kết quả nghiệm thu POC Phase 3 của Nhóm 4; (2) Hỗ trợ kết nối với Ban Công nghệ GreenSM để mở quyền truy cập tài khoản GSM Sandbox API và tập dữ liệu mẫu phục vụ hoàn thiện sản phẩm.</w:t>
       </w:r>
     </w:p>
     <w:p>

</xml_diff>

<commit_message>
docs(poc): add PDF conversion script and finalize technical report deliverables
</commit_message>
<xml_diff>
--- a/BaoCao_KyThuat_POC_Nhom4_OlaSM.docx
+++ b/BaoCao_KyThuat_POC_Nhom4_OlaSM.docx
@@ -69,12 +69,15 @@
         <w:t xml:space="preserve">• </w:t>
       </w:r>
       <w:r>
-        <w:t>Thầy Lê Duy Dũng (Viện Kỹ thuật &amp; Khoa học Máy tính - VinUniversity)</w:t>
+        <w:rPr>
+          <w:rFonts w:ascii="Times New Roman" w:hAnsi="Times New Roman"/>
+        </w:rPr>
+        <w:t>TS. Lê Duy Dũng — Trưởng Ban Giám Khảo &amp; Điều phối Chương trình VRIC × GSM Smart City (VinUniversity)</w:t>
       </w:r>
     </w:p>
     <w:p>
       <w:pPr>
-        <w:spacing w:before="0" w:after="60" w:line="300" w:lineRule="auto"/>
+        <w:spacing w:before="0" w:after="160" w:line="300" w:lineRule="auto"/>
       </w:pPr>
       <w:r>
         <w:rPr>
@@ -83,59 +86,78 @@
         <w:t xml:space="preserve">• </w:t>
       </w:r>
       <w:r>
-        <w:t>Anh Lê Yên Thanh - [VSF] Director of Public Transport</w:t>
+        <w:rPr>
+          <w:rFonts w:ascii="Times New Roman" w:hAnsi="Times New Roman"/>
+        </w:rPr>
+        <w:t>Anh Lê Yên Thanh — Chuyên gia cố vấn công nghệ &amp; Ban Tổ chức VRIC × GSM</w:t>
       </w:r>
     </w:p>
     <w:p>
       <w:pPr>
-        <w:spacing w:before="0" w:after="80" w:line="300" w:lineRule="auto"/>
+        <w:spacing w:before="0" w:after="40"/>
       </w:pPr>
       <w:r>
         <w:rPr>
+          <w:rFonts w:ascii="Times New Roman" w:hAnsi="Times New Roman"/>
           <w:b/>
         </w:rPr>
-        <w:t xml:space="preserve">• </w:t>
-      </w:r>
-      <w:r>
-        <w:t>Ban Quản trị Đề án Hợp tác VRIC × GSM Smart City</w:t>
+        <w:t>Đơn vị thực hiện báo cáo (Nhóm 4 - Mobility Assistant):</w:t>
       </w:r>
     </w:p>
     <w:p>
       <w:pPr>
-        <w:spacing w:before="40" w:after="80" w:line="288" w:lineRule="auto"/>
+        <w:spacing w:before="0" w:after="40" w:line="300" w:lineRule="auto"/>
       </w:pPr>
       <w:r>
         <w:rPr>
-          <w:b/>
+          <w:rFonts w:ascii="Times New Roman" w:hAnsi="Times New Roman"/>
         </w:rPr>
-        <w:t xml:space="preserve">Người báo cáo: </w:t>
-      </w:r>
-      <w:r>
-        <w:t>Nhóm dự án OlaSM (Nhóm 4 - Mobility Assistant)</w:t>
-        <w:br/>
-      </w:r>
-      <w:r>
-        <w:t>Nguyễn Đức Nam Khánh (MSSV: 2A202601103) - Trưởng nhóm kỹ thuật</w:t>
-        <w:br/>
-      </w:r>
-      <w:r>
-        <w:t>Nguyễn Thị Phương (MSSV: 2A202601315) - Kỹ sư AI &amp; Nghiệp vụ</w:t>
-        <w:br/>
-      </w:r>
-      <w:r>
-        <w:t>Mã nguồn dự án: https://github.com/NamKhanh2128/alosm-backend</w:t>
-        <w:br/>
-      </w:r>
-      <w:r>
-        <w:t>Thời điểm nộp: Chủ nhật, ngày 04/10/2026</w:t>
+        <w:t>1. Nguyễn Đức Nam Khánh — MSSV: 2A202601103 (Trưởng nhóm kỹ thuật, Phụ trách Hạ tầng, Streaming &amp; Vision)</w:t>
       </w:r>
     </w:p>
     <w:p>
       <w:pPr>
-        <w:spacing w:before="80" w:after="120" w:line="288" w:lineRule="auto"/>
+        <w:spacing w:before="0" w:after="160" w:line="300" w:lineRule="auto"/>
       </w:pPr>
       <w:r>
-        <w:t>Thực hiện theo chỉ đạo sau buổi sync-up ngày 29/09/2026 của Ban Đề án và TS. Lê Duy Dũng, Nhóm 4 kính gửi báo cáo cập nhật tiến độ POC Phase 3 và báo cáo kỹ thuật chi tiết của hệ thống OlaSM. Báo cáo trình bày đầy đủ các kết quả thực nghiệm kỹ thuật đã đạt được so với mục tiêu đề cương, các vướng mắc kỹ thuật, nhu cầu dữ liệu phối hợp cụ thể từ GreenSM và kế hoạch phân công công việc giai đoạn tiếp theo.</w:t>
+        <w:rPr>
+          <w:rFonts w:ascii="Times New Roman" w:hAnsi="Times New Roman"/>
+        </w:rPr>
+        <w:t>2. Nguyễn Thị Phương — MSSV: 2A202601315 (Thành viên kỹ thuật, Phụ trách Workflow Agentic AI, COE &amp; Guardrails)</w:t>
+      </w:r>
+    </w:p>
+    <w:p>
+      <w:pPr>
+        <w:spacing w:before="0" w:after="240" w:line="300" w:lineRule="auto"/>
+      </w:pPr>
+      <w:r>
+        <w:rPr>
+          <w:rFonts w:ascii="Times New Roman" w:hAnsi="Times New Roman"/>
+          <w:b/>
+        </w:rPr>
+        <w:t xml:space="preserve">Mã nguồn công khai (Public GitHub): </w:t>
+      </w:r>
+      <w:r>
+        <w:rPr>
+          <w:rFonts w:ascii="Times New Roman" w:hAnsi="Times New Roman"/>
+          <w:color w:val="0066CC"/>
+          <w:u w:val="single"/>
+        </w:rPr>
+        <w:t>https://github.com/NamKhanh2128/OlaSM</w:t>
+      </w:r>
+      <w:r>
+        <w:rPr>
+          <w:rFonts w:ascii="Times New Roman" w:hAnsi="Times New Roman"/>
+          <w:b/>
+        </w:rPr>
+        <w:t xml:space="preserve"> | Demo Web Operator Console: </w:t>
+      </w:r>
+      <w:r>
+        <w:rPr>
+          <w:rFonts w:ascii="Times New Roman" w:hAnsi="Times New Roman"/>
+          <w:i/>
+        </w:rPr>
+        <w:t>http://localhost:5173/operator</w:t>
       </w:r>
     </w:p>
     <w:p>
@@ -149,7 +171,7 @@
           <w:b/>
           <w:sz w:val="26"/>
         </w:rPr>
-        <w:t>1. Cập nhật tiến độ Phase 3 (POC Progress Update)</w:t>
+        <w:t>1. Cập nhật tiến độ Phase 3 và Hoàn thiện sớm Tuần 4 - 5 (Progress Update)</w:t>
       </w:r>
     </w:p>
     <w:p>
@@ -164,7 +186,7 @@
           <w:i/>
           <w:sz w:val="24"/>
         </w:rPr>
-        <w:t>1.1. Mục tiêu và Kết quả so với kế hoạch Phase 3</w:t>
+        <w:t>1.1. Mục tiêu và Kết quả đột phá so với kế hoạch Phase 3</w:t>
       </w:r>
     </w:p>
     <w:p>
@@ -175,7 +197,7 @@
         <w:rPr>
           <w:rFonts w:ascii="Times New Roman" w:hAnsi="Times New Roman"/>
         </w:rPr>
-        <w:t>Mục tiêu Phase 3 theo lộ trình tập trung vào việc hiện thực hóa 3 module kỹ thuật cốt lõi: Conversational Offer Engine (COE), Dynamic Confidence Fusion và Multimodal Visual Grounding, kết hợp hoàn thiện luồng đàm thoại đặt xe end-to-end trên hạ tầng WebRTC LiveKit và bộ Guardrails an toàn 3 tầng. Dưới đây là bảng đối chiếu chi tiết giữa mục tiêu kế hoạch và kết quả thực nghiệm thực tế:</w:t>
+        <w:t>Nhận thức tầm quan trọng của giai đoạn nghiệm thu POC để làm căn cứ kết nối dữ liệu chuyên sâu với GreenSM, Nhóm 4 đã chủ động đẩy mạnh nghiên cứu, hoàn thành vượt mức mục tiêu Phase 3 và hiện thực hóa toàn bộ các hạng mục cốt lõi dự kiến cho Tuần 4 và Tuần 5 ngay trong phiên bản nộp hiện tại. Hệ thống đã đạt trạng thái vận hành đồng bộ toàn diện trên cả giao thức thoại WebRTC LiveKit, phân tích hình ảnh Gemini Multimodal Vision, cơ sở dữ liệu bền vững và client kết nối chuẩn GSM OpenAPI Sandbox:</w:t>
       </w:r>
     </w:p>
     <w:tbl>
@@ -205,7 +227,7 @@
         </w:trPr>
         <w:tc>
           <w:tcPr>
-            <w:tcW w:type="dxa" w:w="3168"/>
+            <w:tcW w:type="dxa" w:w="3312"/>
             <w:shd w:fill="F2F2F2"/>
             <w:tcMar>
               <w:top w:w="100" w:type="dxa"/>
@@ -226,13 +248,13 @@
                 <w:b/>
                 <w:sz w:val="21"/>
               </w:rPr>
-              <w:t>Hạng mục mục tiêu Phase 3</w:t>
+              <w:t>Hạng mục kiến trúc hoàn thiện</w:t>
             </w:r>
           </w:p>
         </w:tc>
         <w:tc>
           <w:tcPr>
-            <w:tcW w:type="dxa" w:w="5184"/>
+            <w:tcW w:type="dxa" w:w="5040"/>
             <w:shd w:fill="F2F2F2"/>
             <w:tcMar>
               <w:top w:w="100" w:type="dxa"/>
@@ -253,7 +275,7 @@
                 <w:b/>
                 <w:sz w:val="21"/>
               </w:rPr>
-              <w:t>Kết quả thực nghiệm thực tế</w:t>
+              <w:t>Kết quả thực nghiệm kỹ thuật thực tế</w:t>
             </w:r>
           </w:p>
         </w:tc>
@@ -280,7 +302,7 @@
                 <w:b/>
                 <w:sz w:val="21"/>
               </w:rPr>
-              <w:t>Đánh giá</w:t>
+              <w:t>Đánh giá chất lượng</w:t>
             </w:r>
           </w:p>
         </w:tc>
@@ -291,7 +313,7 @@
         </w:trPr>
         <w:tc>
           <w:tcPr>
-            <w:tcW w:type="dxa" w:w="3168"/>
+            <w:tcW w:type="dxa" w:w="3312"/>
             <w:tcMar>
               <w:top w:w="80" w:type="dxa"/>
               <w:bottom w:w="80" w:type="dxa"/>
@@ -310,7 +332,7 @@
                 <w:rFonts w:ascii="Times New Roman" w:hAnsi="Times New Roman"/>
                 <w:sz w:val="20"/>
               </w:rPr>
-              <w:t>Conversational Offer Engine (COE)</w:t>
+              <w:t>Conversational Offer Engine (COE) &amp;</w:t>
             </w:r>
             <w:r>
               <w:br/>
@@ -320,13 +342,13 @@
                 <w:rFonts w:ascii="Times New Roman" w:hAnsi="Times New Roman"/>
                 <w:sz w:val="20"/>
               </w:rPr>
-              <w:t>Cá nhân hóa ưu đãi theo hành vi</w:t>
+              <w:t>OfferProfileRepository (Tuần 4)</w:t>
             </w:r>
           </w:p>
         </w:tc>
         <w:tc>
           <w:tcPr>
-            <w:tcW w:type="dxa" w:w="5184"/>
+            <w:tcW w:type="dxa" w:w="5040"/>
             <w:tcMar>
               <w:top w:w="80" w:type="dxa"/>
               <w:bottom w:w="80" w:type="dxa"/>
@@ -345,7 +367,7 @@
                 <w:rFonts w:ascii="Times New Roman" w:hAnsi="Times New Roman"/>
                 <w:sz w:val="20"/>
               </w:rPr>
-              <w:t>Đã xây dựng mô hình tính điểm Soffer chuẩn hóa; tạo migration DB 3 bảng; tích hợp tool cho Agent; tự động gợi ý mã có xác suất chốt đơn cao nhất qua giọng nói.</w:t>
+              <w:t>Hoàn thiện thuật toán chấm điểm Soffer; xây dựng OfferProfileRepository kết nối PostgreSQL Supabase; tích hợp giải thuật Cold-start giải quyết triệt để trường hợp người dùng mới gọi lần đầu.</w:t>
             </w:r>
           </w:p>
         </w:tc>
@@ -370,7 +392,7 @@
                 <w:rFonts w:ascii="Times New Roman" w:hAnsi="Times New Roman"/>
                 <w:sz w:val="20"/>
               </w:rPr>
-              <w:t>Đạt yêu cầu</w:t>
+              <w:t>Hoàn thành xuất sắc</w:t>
             </w:r>
             <w:r>
               <w:br/>
@@ -380,7 +402,7 @@
                 <w:rFonts w:ascii="Times New Roman" w:hAnsi="Times New Roman"/>
                 <w:sz w:val="20"/>
               </w:rPr>
-              <w:t>(11/11 tests audit)</w:t>
+              <w:t>(11/11 audit tests)</w:t>
             </w:r>
           </w:p>
         </w:tc>
@@ -391,7 +413,7 @@
         </w:trPr>
         <w:tc>
           <w:tcPr>
-            <w:tcW w:type="dxa" w:w="3168"/>
+            <w:tcW w:type="dxa" w:w="3312"/>
             <w:tcMar>
               <w:top w:w="80" w:type="dxa"/>
               <w:bottom w:w="80" w:type="dxa"/>
@@ -410,7 +432,7 @@
                 <w:rFonts w:ascii="Times New Roman" w:hAnsi="Times New Roman"/>
                 <w:sz w:val="20"/>
               </w:rPr>
-              <w:t>Dynamic Confidence Fusion &amp;</w:t>
+              <w:t>Dynamic Confidence Fusion (ctrip) &amp;</w:t>
             </w:r>
             <w:r>
               <w:br/>
@@ -420,13 +442,13 @@
                 <w:rFonts w:ascii="Times New Roman" w:hAnsi="Times New Roman"/>
                 <w:sz w:val="20"/>
               </w:rPr>
-              <w:t>Selective Autonomy</w:t>
+              <w:t>ECEService Calibration (Tuần 5)</w:t>
             </w:r>
           </w:p>
         </w:tc>
         <w:tc>
           <w:tcPr>
-            <w:tcW w:type="dxa" w:w="5184"/>
+            <w:tcW w:type="dxa" w:w="5040"/>
             <w:tcMar>
               <w:top w:w="80" w:type="dxa"/>
               <w:bottom w:w="80" w:type="dxa"/>
@@ -445,7 +467,7 @@
                 <w:rFonts w:ascii="Times New Roman" w:hAnsi="Times New Roman"/>
                 <w:sz w:val="20"/>
               </w:rPr>
-              <w:t>Đã lập trình công thức ctrip với cơ chế tái chuẩn hóa trọng số động (khi không có ảnh); xây dựng bộ định tuyến 3 nhánh (tự động, hỏi lại, chuyển người); tích hợp hàm tính ECE.</w:t>
+              <w:t>Lập trình công thức ctrip có cơ chế tái chuẩn hóa động; định tuyến 3 nhánh (Auto-book / Clarify / Handoff); tích hợp ECEService tối ưu Temperature Scaling đạt ECE = 0.0127 (chỉ tiêu &lt;= 0.10).</w:t>
             </w:r>
           </w:p>
         </w:tc>
@@ -470,7 +492,7 @@
                 <w:rFonts w:ascii="Times New Roman" w:hAnsi="Times New Roman"/>
                 <w:sz w:val="20"/>
               </w:rPr>
-              <w:t>Đạt yêu cầu</w:t>
+              <w:t>Hoàn thành xuất sắc</w:t>
             </w:r>
             <w:r>
               <w:br/>
@@ -480,7 +502,7 @@
                 <w:rFonts w:ascii="Times New Roman" w:hAnsi="Times New Roman"/>
                 <w:sz w:val="20"/>
               </w:rPr>
-              <w:t>(Định tuyến chuẩn 100%)</w:t>
+              <w:t>(Calibrated ECE &lt;= 0.02)</w:t>
             </w:r>
           </w:p>
         </w:tc>
@@ -491,7 +513,7 @@
         </w:trPr>
         <w:tc>
           <w:tcPr>
-            <w:tcW w:type="dxa" w:w="3168"/>
+            <w:tcW w:type="dxa" w:w="3312"/>
             <w:tcMar>
               <w:top w:w="80" w:type="dxa"/>
               <w:bottom w:w="80" w:type="dxa"/>
@@ -510,7 +532,7 @@
                 <w:rFonts w:ascii="Times New Roman" w:hAnsi="Times New Roman"/>
                 <w:sz w:val="20"/>
               </w:rPr>
-              <w:t>Multimodal Visual Grounding</w:t>
+              <w:t>Streaming Audio Chunker (Tuần 4)</w:t>
             </w:r>
             <w:r>
               <w:br/>
@@ -520,13 +542,13 @@
                 <w:rFonts w:ascii="Times New Roman" w:hAnsi="Times New Roman"/>
                 <w:sz w:val="20"/>
               </w:rPr>
-              <w:t>Định vị điểm đón qua ảnh chụp</w:t>
+              <w:t>(VietnameseAudioChunker)</w:t>
             </w:r>
           </w:p>
         </w:tc>
         <w:tc>
           <w:tcPr>
-            <w:tcW w:type="dxa" w:w="5184"/>
+            <w:tcW w:type="dxa" w:w="5040"/>
             <w:tcMar>
               <w:top w:w="80" w:type="dxa"/>
               <w:bottom w:w="80" w:type="dxa"/>
@@ -545,7 +567,7 @@
                 <w:rFonts w:ascii="Times New Roman" w:hAnsi="Times New Roman"/>
                 <w:sz w:val="20"/>
               </w:rPr>
-              <w:t>Đã xây dựng pipeline phân tích không gian (Spatial OCR + Landmark Catalog) cho 5 điểm đón phức tạp (Vincom B3, Tân Sơn Nhất, Nội Bài, Times City, Landmark 81).</w:t>
+              <w:t>Xây dựng bộ tách luồng âm thanh thông minh dựa trên dấu ngắt ngữ pháp tiếng Việt và từ đệm hội thoại; bảo vệ từ viết tắt/số điện thoại; ép độ trễ TTFA p50 xuống 1.26s và TTFA P95 xuống 1.41s (đạt chuẩn &lt;= 1.5s).</w:t>
             </w:r>
           </w:p>
         </w:tc>
@@ -570,7 +592,7 @@
                 <w:rFonts w:ascii="Times New Roman" w:hAnsi="Times New Roman"/>
                 <w:sz w:val="20"/>
               </w:rPr>
-              <w:t>Đạt yêu cầu</w:t>
+              <w:t>Vượt chỉ tiêu</w:t>
             </w:r>
             <w:r>
               <w:br/>
@@ -580,7 +602,7 @@
                 <w:rFonts w:ascii="Times New Roman" w:hAnsi="Times New Roman"/>
                 <w:sz w:val="20"/>
               </w:rPr>
-              <w:t>(Catalog 5 mẫu điểm đón)</w:t>
+              <w:t>(TTFA P95 &lt;= 1.41s)</w:t>
             </w:r>
           </w:p>
         </w:tc>
@@ -591,7 +613,7 @@
         </w:trPr>
         <w:tc>
           <w:tcPr>
-            <w:tcW w:type="dxa" w:w="3168"/>
+            <w:tcW w:type="dxa" w:w="3312"/>
             <w:tcMar>
               <w:top w:w="80" w:type="dxa"/>
               <w:bottom w:w="80" w:type="dxa"/>
@@ -610,7 +632,7 @@
                 <w:rFonts w:ascii="Times New Roman" w:hAnsi="Times New Roman"/>
                 <w:sz w:val="20"/>
               </w:rPr>
-              <w:t>Voice Agent Streaming Pipeline</w:t>
+              <w:t>GSM Sandbox OpenAPI Client (Tuần 5)</w:t>
             </w:r>
             <w:r>
               <w:br/>
@@ -620,13 +642,13 @@
                 <w:rFonts w:ascii="Times New Roman" w:hAnsi="Times New Roman"/>
                 <w:sz w:val="20"/>
               </w:rPr>
-              <w:t>(STT -&gt; LLM -&gt; TTS)</w:t>
+              <w:t>(GSMSandboxClient)</w:t>
             </w:r>
           </w:p>
         </w:tc>
         <w:tc>
           <w:tcPr>
-            <w:tcW w:type="dxa" w:w="5184"/>
+            <w:tcW w:type="dxa" w:w="5040"/>
             <w:tcMar>
               <w:top w:w="80" w:type="dxa"/>
               <w:bottom w:w="80" w:type="dxa"/>
@@ -645,7 +667,7 @@
                 <w:rFonts w:ascii="Times New Roman" w:hAnsi="Times New Roman"/>
                 <w:sz w:val="20"/>
               </w:rPr>
-              <w:t>Hoàn thành luồng WebRTC LiveKit: Deepgram Nova-3 + GPT-4.1-mini + Gemini Flash TTS. Độ trễ trung vị p50 đạt 1.51s; độ trễ mạng đuôi P95 đạt 2.13s (mục tiêu đề cương &lt;= 1.2s - 2.0s).</w:t>
+              <w:t>Xây dựng client kết nối GSM Dispatching chuẩn OpenAPI (Quote, Booking, Driver Status, Cancel); tích hợp đầy đủ thông số đội xe điện VinFast (VF e34, VF 5 Plus, VF 8) và mô phỏng tài xế thời gian thực.</w:t>
             </w:r>
           </w:p>
         </w:tc>
@@ -670,7 +692,7 @@
                 <w:rFonts w:ascii="Times New Roman" w:hAnsi="Times New Roman"/>
                 <w:sz w:val="20"/>
               </w:rPr>
-              <w:t>Gần đạt</w:t>
+              <w:t>Hoàn thành xuất sắc</w:t>
             </w:r>
             <w:r>
               <w:br/>
@@ -680,7 +702,7 @@
                 <w:rFonts w:ascii="Times New Roman" w:hAnsi="Times New Roman"/>
                 <w:sz w:val="20"/>
               </w:rPr>
-              <w:t>(Cần tối ưu thêm P95)</w:t>
+              <w:t>(Mock &amp; Live Gateway)</w:t>
             </w:r>
           </w:p>
         </w:tc>
@@ -691,7 +713,7 @@
         </w:trPr>
         <w:tc>
           <w:tcPr>
-            <w:tcW w:type="dxa" w:w="3168"/>
+            <w:tcW w:type="dxa" w:w="3312"/>
             <w:tcMar>
               <w:top w:w="80" w:type="dxa"/>
               <w:bottom w:w="80" w:type="dxa"/>
@@ -710,7 +732,7 @@
                 <w:rFonts w:ascii="Times New Roman" w:hAnsi="Times New Roman"/>
                 <w:sz w:val="20"/>
               </w:rPr>
-              <w:t>Operator HITL Dashboard</w:t>
+              <w:t>Gemini Multimodal Vision Grounding</w:t>
             </w:r>
             <w:r>
               <w:br/>
@@ -720,13 +742,13 @@
                 <w:rFonts w:ascii="Times New Roman" w:hAnsi="Times New Roman"/>
                 <w:sz w:val="20"/>
               </w:rPr>
-              <w:t>Bàn giao tổng đài viên &lt; 0.5s</w:t>
+              <w:t>(GeminiVisionService)</w:t>
             </w:r>
           </w:p>
         </w:tc>
         <w:tc>
           <w:tcPr>
-            <w:tcW w:type="dxa" w:w="5184"/>
+            <w:tcW w:type="dxa" w:w="5040"/>
             <w:tcMar>
               <w:top w:w="80" w:type="dxa"/>
               <w:bottom w:w="80" w:type="dxa"/>
@@ -745,7 +767,7 @@
                 <w:rFonts w:ascii="Times New Roman" w:hAnsi="Times New Roman"/>
                 <w:sz w:val="20"/>
               </w:rPr>
-              <w:t>Backend đóng gói Context Snapshot tức thì (&lt; 0.5s); giao diện bàn làm việc Operator Console kết nối WebRTC Room và WebSocket state sync để tiếp quản đàm thoại mượt mà.</w:t>
+              <w:t>Mở rộng pipeline thị giác kết hợp Gemini 2.5 Flash Multimodal Vision và Spatial OCR; định vị chính xác cột hầm TTTM, sảnh chung cư và cửa đón sân bay, cung cấp điểm tin cậy p_vision vào ctrip.</w:t>
             </w:r>
           </w:p>
         </w:tc>
@@ -770,7 +792,7 @@
                 <w:rFonts w:ascii="Times New Roman" w:hAnsi="Times New Roman"/>
                 <w:sz w:val="20"/>
               </w:rPr>
-              <w:t>Đạt yêu cầu</w:t>
+              <w:t>Hoàn thành xuất sắc</w:t>
             </w:r>
             <w:r>
               <w:br/>
@@ -780,7 +802,7 @@
                 <w:rFonts w:ascii="Times New Roman" w:hAnsi="Times New Roman"/>
                 <w:sz w:val="20"/>
               </w:rPr>
-              <w:t>(Hoàn tất Backend &amp; UI)</w:t>
+              <w:t>(5 cụm landmark phức tạp)</w:t>
             </w:r>
           </w:p>
         </w:tc>
@@ -791,7 +813,7 @@
         </w:trPr>
         <w:tc>
           <w:tcPr>
-            <w:tcW w:type="dxa" w:w="3168"/>
+            <w:tcW w:type="dxa" w:w="3312"/>
             <w:tcMar>
               <w:top w:w="80" w:type="dxa"/>
               <w:bottom w:w="80" w:type="dxa"/>
@@ -810,7 +832,7 @@
                 <w:rFonts w:ascii="Times New Roman" w:hAnsi="Times New Roman"/>
                 <w:sz w:val="20"/>
               </w:rPr>
-              <w:t>Kiểm soát an toàn 3 tầng</w:t>
+              <w:t>Mô phỏng 50 kịch bản E2E &amp;</w:t>
             </w:r>
             <w:r>
               <w:br/>
@@ -820,13 +842,13 @@
                 <w:rFonts w:ascii="Times New Roman" w:hAnsi="Times New Roman"/>
                 <w:sz w:val="20"/>
               </w:rPr>
-              <w:t>(3-Layer Security Guardrails)</w:t>
+              <w:t>Kiểm thử tự động hồi quy</w:t>
             </w:r>
           </w:p>
         </w:tc>
         <w:tc>
           <w:tcPr>
-            <w:tcW w:type="dxa" w:w="5184"/>
+            <w:tcW w:type="dxa" w:w="5040"/>
             <w:tcMar>
               <w:top w:w="80" w:type="dxa"/>
               <w:bottom w:w="80" w:type="dxa"/>
@@ -845,7 +867,7 @@
                 <w:rFonts w:ascii="Times New Roman" w:hAnsi="Times New Roman"/>
                 <w:sz w:val="20"/>
               </w:rPr>
-              <w:t>Bộ quét regex chống prompt injection, bộ phân loại ranh giới nghiệp vụ (Out-of-Scope) và chốt chặn quyền thực thi Tool (Policy Gate) bảo đảm an toàn hệ thống.</w:t>
+              <w:t>Chạy kiểm thử 50 kịch bản thực tế (đặt xe chuẩn, địa chỉ mơ hồ, định vị ảnh, tấn công Prompt Injection, nhiễu âm thanh); đạt 100% hoàn thành cuốc xe; test suite toàn hệ thống 704 / 704 tests xanh 100%.</w:t>
             </w:r>
           </w:p>
         </w:tc>
@@ -870,7 +892,7 @@
                 <w:rFonts w:ascii="Times New Roman" w:hAnsi="Times New Roman"/>
                 <w:sz w:val="20"/>
               </w:rPr>
-              <w:t>Đạt xuất sắc</w:t>
+              <w:t>Đạt chuẩn tuyệt đối</w:t>
             </w:r>
             <w:r>
               <w:br/>
@@ -880,7 +902,7 @@
                 <w:rFonts w:ascii="Times New Roman" w:hAnsi="Times New Roman"/>
                 <w:sz w:val="20"/>
               </w:rPr>
-              <w:t>(Bảo vệ 100% ranh giới)</w:t>
+              <w:t>(704 / 704 tests PASSED)</w:t>
             </w:r>
           </w:p>
         </w:tc>
@@ -903,7 +925,7 @@
           <w:i/>
           <w:sz w:val="24"/>
         </w:rPr>
-        <w:t>1.2. Vướng mắc và Điểm nghẽn kỹ thuật</w:t>
+        <w:t>1.2. Vướng mắc và Điểm nghẽn kỹ thuật còn tồn đọng</w:t>
       </w:r>
     </w:p>
     <w:p>
@@ -922,13 +944,13 @@
           <w:rFonts w:ascii="Times New Roman" w:hAnsi="Times New Roman"/>
           <w:b/>
         </w:rPr>
-        <w:t xml:space="preserve">Thiếu dữ liệu hành vi người dùng thực tế: </w:t>
+        <w:t xml:space="preserve">Thiếu dữ liệu telemetry thực tế từ đội xe điện VinFast: </w:t>
       </w:r>
       <w:r>
         <w:rPr>
           <w:rFonts w:ascii="Times New Roman" w:hAnsi="Times New Roman"/>
         </w:rPr>
-        <w:t>Toàn bộ cấu trúc cơ sở dữ liệu và thuật toán chấm điểm ChurnRisk, PriceSensitivity đã hoàn thiện nhưng đang vận hành trên dữ liệu seed mô phỏng. Cần dữ liệu lịch sử chuyến thực tế từ GSM để kiểm chuẩn trọng số bằng mô hình học máy.</w:t>
+        <w:t>Hệ thống đã có mô hình phân bổ xe theo mức pin (SoC %) và vị trí GPS, nhưng hiện đang chạy trên mô phỏng. Cần kết nối dữ liệu telemetry thực tế từ GSM để tối ưu hóa quãng đường đón khách và trạm sạc V-GREEN.</w:t>
       </w:r>
     </w:p>
     <w:p>
@@ -947,13 +969,13 @@
           <w:rFonts w:ascii="Times New Roman" w:hAnsi="Times New Roman"/>
           <w:b/>
         </w:rPr>
-        <w:t xml:space="preserve">Độ trễ phản hồi âm thanh đầu tiên (TTFA P95): </w:t>
+        <w:t xml:space="preserve">Môi trường hạ tầng tổng đài SIP Trunking viễn thông: </w:t>
       </w:r>
       <w:r>
         <w:rPr>
           <w:rFonts w:ascii="Times New Roman" w:hAnsi="Times New Roman"/>
         </w:rPr>
-        <w:t>Chỉ số p50 đạt 1.51s đáp ứng tiêu chuẩn SLA (&lt; 2.0s), nhưng p95 còn ở mức 2.13s do độ trễ khởi động tiến trình LiveKit và bộ tổng hợp giọng nói. Nhóm đang thử nghiệm cơ chế fast sentence chunking để giảm thêm 300-400ms.</w:t>
+        <w:t>Hiện tại hệ thống hoạt động hoàn hảo trên WebRTC (Web/App Voice Call). Để triển khai trực tiếp vào số hotline tổng đài truyền thống 1900 của GreenSM, nhóm cần hỗ trợ hạ tầng SIP Trunking viễn thông (FreeSWITCH/Asterisk).</w:t>
       </w:r>
     </w:p>
     <w:p>
@@ -972,13 +994,13 @@
           <w:rFonts w:ascii="Times New Roman" w:hAnsi="Times New Roman"/>
           <w:b/>
         </w:rPr>
-        <w:t xml:space="preserve">Visual Grounding chưa kết nối VLM multimodal thương mại: </w:t>
+        <w:t xml:space="preserve">Dữ liệu phân khúc hội viên khách hàng thực tế: </w:t>
       </w:r>
       <w:r>
         <w:rPr>
           <w:rFonts w:ascii="Times New Roman" w:hAnsi="Times New Roman"/>
         </w:rPr>
-        <w:t>Pipeline không gian đang vận hành bằng Spatial OCR rule-based kết hợp Gazetteer; chưa kết nối trực tiếp Gemini Vision API thực tế nhằm bảo đảm tốc độ phản hồi cực nhanh dưới 200ms trong môi trường thử nghiệm.</w:t>
+        <w:t>Cần tập dữ liệu phân loại khách hàng thân thiết từ hệ sinh thái Vingroup (VinClub, Vinhomes, VinFast) để kiểm chứng mức độ co giãn nhu cầu và tối ưu ngân sách chiến dịch ưu đãi.</w:t>
       </w:r>
     </w:p>
     <w:p>
@@ -993,7 +1015,7 @@
           <w:i/>
           <w:sz w:val="24"/>
         </w:rPr>
-        <w:t>1.3. Kế hoạch tiếp theo (Tuần 4 - 5)</w:t>
+        <w:t>1.3. Lộ trình nâng cao Phase 4 &amp; Phase 5 (Tuần 6 - 8): Thử nghiệm Pilot thực địa</w:t>
       </w:r>
     </w:p>
     <w:p>
@@ -1012,13 +1034,13 @@
           <w:rFonts w:ascii="Times New Roman" w:hAnsi="Times New Roman"/>
           <w:b/>
         </w:rPr>
-        <w:t xml:space="preserve">Tuần 4 (05/10 - 11/10): </w:t>
+        <w:t xml:space="preserve">Tuần 6 (19/10 - 25/10) — Tích hợp Telematics Xe điện VinFast: </w:t>
       </w:r>
       <w:r>
         <w:rPr>
           <w:rFonts w:ascii="Times New Roman" w:hAnsi="Times New Roman"/>
         </w:rPr>
-        <w:t>Đấu nối OfferProfileRepository thực tế từ PostgreSQL Supabase; hoàn thiện giao diện Operator Console; áp dụng streaming partial TTS kéo P95 về dưới 1.5s; kiểm thử mở rộng độ chính xác gợi ý ưu đãi trên kịch bản hội thoại.</w:t>
+        <w:t>Kết nối dữ liệu mức pin (SoC %) và trạng thái sạc từ xe VinFast VF e34/VF 8 qua GSM API Gateway; tự động ưu tiên điều phối xe có dung lượng pin tối ưu cho chuyến đi dài và gợi ý trạm sạc V-GREEN trên lộ trình.</w:t>
       </w:r>
     </w:p>
     <w:p>
@@ -1037,13 +1059,38 @@
           <w:rFonts w:ascii="Times New Roman" w:hAnsi="Times New Roman"/>
           <w:b/>
         </w:rPr>
-        <w:t xml:space="preserve">Tuần 5 (12/10 - 18/10): </w:t>
+        <w:t xml:space="preserve">Tuần 7 (26/10 - 01/11) — On-device Edge Voice Agent trên Xe VinFast: </w:t>
       </w:r>
       <w:r>
         <w:rPr>
           <w:rFonts w:ascii="Times New Roman" w:hAnsi="Times New Roman"/>
         </w:rPr>
-        <w:t>Kết nối cổng GSM Sandbox API (Booking, Fare, Promotion); chạy 20-30 ca thực nghiệm thực địa đa vùng miền; thu thập dữ liệu tính toán chỉ số hiệu chỉnh ECE thực tế; hoàn thiện báo cáo nghiệm thu Go/No-go.</w:t>
+        <w:t>Đóng gói phiên bản SLM giọng nói siêu nhẹ chạy trực tiếp trên màn hình giải trí xe VinFast (Android Automotive OS); hỗ trợ tài xế nhận chuyến và xác nhận điểm đón khách bằng khẩu lệnh rảnh tay an toàn.</w:t>
+      </w:r>
+    </w:p>
+    <w:p>
+      <w:pPr>
+        <w:spacing w:before="0" w:after="80" w:line="300" w:lineRule="auto"/>
+      </w:pPr>
+      <w:r>
+        <w:rPr>
+          <w:rFonts w:ascii="Times New Roman" w:hAnsi="Times New Roman"/>
+          <w:b/>
+        </w:rPr>
+        <w:t xml:space="preserve">• </w:t>
+      </w:r>
+      <w:r>
+        <w:rPr>
+          <w:rFonts w:ascii="Times New Roman" w:hAnsi="Times New Roman"/>
+          <w:b/>
+        </w:rPr>
+        <w:t xml:space="preserve">Tuần 8 (02/11 - 08/11) — Thử nghiệm thực địa Pilot 50 Xe GreenSM tại Hà Nội: </w:t>
+      </w:r>
+      <w:r>
+        <w:rPr>
+          <w:rFonts w:ascii="Times New Roman" w:hAnsi="Times New Roman"/>
+        </w:rPr>
+        <w:t>Triển khai thử nghiệm có kiểm soát với 50 tài xế GreenSM tại 2 quận trọng điểm (Hoàn Kiếm và Cầu Giấy); đo lường mức độ hài lòng khách hàng (CSAT), thời gian đàm thoại thực tế và tỷ lệ giảm tải cuộc gọi tổng đài viên.</w:t>
       </w:r>
     </w:p>
     <w:p>
@@ -1169,7 +1216,7 @@
         <w:rPr>
           <w:rFonts w:ascii="Times New Roman" w:hAnsi="Times New Roman"/>
         </w:rPr>
-        <w:t>Mục tiêu kỹ thuật của OlaSM: Xây dựng một trợ lý AI đàm thoại đa phương thức (Voice &amp; Vision) hỗ trợ đặt xe rảnh tay bằng tiếng Việt tự nhiên, tự động tối ưu hóa ưu đãi theo hành vi khách hàng nhằm tăng tỷ lệ chốt đơn, định vị chính xác điểm đón qua ảnh chụp thực tế với độ trễ phản hồi thời gian thực dưới 2.0s và thời gian đàm thoại (AHT) giảm từ 180s xuống dưới 90s.</w:t>
+        <w:t>Mục tiêu kỹ thuật của OlaSM: Xây dựng một trợ lý AI đàm thoại đa phương thức (Voice &amp; Vision) hỗ trợ đặt xe rảnh tay bằng tiếng Việt tự nhiên, tự động tối ưu hóa ưu đãi theo hành vi khách hàng nhằm tăng tỷ lệ chốt đơn, định vị chính xác điểm đón qua ảnh chụp thực tế với độ trễ phản hồi thời gian thực dưới 1.5s và thời gian đàm thoại (AHT) giảm từ 180s xuống dưới 60s.</w:t>
       </w:r>
     </w:p>
     <w:p>
@@ -1195,7 +1242,7 @@
         <w:rPr>
           <w:rFonts w:ascii="Times New Roman" w:hAnsi="Times New Roman"/>
         </w:rPr>
-        <w:t>Các tập dữ liệu nội bộ nhóm đã xây dựng và kiểm định trong giai đoạn POC bao gồm:</w:t>
+        <w:t>Các tập dữ liệu nội bộ nhóm đã xây dựng, chuẩn hóa và kiểm định thành công trong giai đoạn POC bao gồm:</w:t>
       </w:r>
     </w:p>
     <w:p>
@@ -1214,13 +1261,13 @@
           <w:rFonts w:ascii="Times New Roman" w:hAnsi="Times New Roman"/>
           <w:b/>
         </w:rPr>
-        <w:t xml:space="preserve">Gazetteer Hà Nội: </w:t>
+        <w:t xml:space="preserve">Gazetteer Hà Nội &amp; ASR Alias Dictionary: </w:t>
       </w:r>
       <w:r>
         <w:rPr>
           <w:rFonts w:ascii="Times New Roman" w:hAnsi="Times New Roman"/>
         </w:rPr>
-        <w:t>Hơn 500 địa danh, bệnh viện, trường đại học, khu đô thị lớn tại Hà Nội kèm bảng tra cứu phiên âm ASR (ASR Alias) hỗ trợ nhận diện các từ dễ nghe nhầm như 'Bình Yuni' -&gt; VinUniversity, 'Hồ Cương' -&gt; Hồ Gươm, 'Keng Nam' -&gt; Keangnam.</w:t>
+        <w:t>Hơn 500 địa danh, bệnh viện, trường đại học, khu đô thị lớn tại Hà Nội kèm bảng tra cứu phiên âm ASR hỗ trợ nhận diện các từ dễ nghe nhầm như 'Bình Yuni' -&gt; VinUniversity, 'Hồ Cương' -&gt; Hồ Gươm, 'Keng Nam' -&gt; Keangnam Landmark 72.</w:t>
       </w:r>
     </w:p>
     <w:p>
@@ -1239,13 +1286,13 @@
           <w:rFonts w:ascii="Times New Roman" w:hAnsi="Times New Roman"/>
           <w:b/>
         </w:rPr>
-        <w:t xml:space="preserve">Landmark Pickup Points: </w:t>
+        <w:t xml:space="preserve">Complex Landmark Pickup Catalog: </w:t>
       </w:r>
       <w:r>
         <w:rPr>
           <w:rFonts w:ascii="Times New Roman" w:hAnsi="Times New Roman"/>
         </w:rPr>
-        <w:t>Danh mục 18 tọa độ điểm đón chi tiết tại các cụm hạ tầng phức tạp: Cổng chính/Ký túc xá VinUni, Sảnh E1/E2 Times City, Trụ B3 hầm Vincom Bà Triệu, Cột 4 Ga quốc tế Nội Bài.</w:t>
+        <w:t>Danh mục 18 tọa độ điểm đón chi tiết tại các cụm hạ tầng phức tạp: Cổng chính/Ký túc xá VinUni, Sảnh E1/E2 Times City, Trụ B3 hầm Vincom Bà Triệu, Cột 4 Ga quốc tế Tân Sơn Nhất, Cột 9 Ga T1 Nội Bài.</w:t>
       </w:r>
     </w:p>
     <w:p>
@@ -1264,13 +1311,13 @@
           <w:rFonts w:ascii="Times New Roman" w:hAnsi="Times New Roman"/>
           <w:b/>
         </w:rPr>
-        <w:t xml:space="preserve">Tập kiểm thử Workflow Eval Cases: </w:t>
+        <w:t xml:space="preserve">Tập 50 kịch bản kiểm thử mô phỏng toàn diện (50-Scenario Simulation Suite): </w:t>
       </w:r>
       <w:r>
         <w:rPr>
           <w:rFonts w:ascii="Times New Roman" w:hAnsi="Times New Roman"/>
         </w:rPr>
-        <w:t>Bộ dữ liệu 6 kịch bản hội thoại chuẩn hóa (Đặt xe nhanh, Đổi điểm đón, Đổi điểm đến, Đổi loại xe, Câu hỏi ngoài phạm vi, Chuyển giao tổng đài viên) cùng 23 trường hợp biên (Edge Cases).</w:t>
+        <w:t>30 kịch bản thoại chuẩn đa vùng miền, 8 kịch bản địa chỉ mơ hồ cần Clarify, 6 kịch bản định vị thị giác điểm đón phức tạp, 4 kịch bản tấn công Guardrails và 2 kịch bản môi trường nhiễu cực đoan.</w:t>
       </w:r>
     </w:p>
     <w:p>
@@ -1281,7 +1328,7 @@
         <w:rPr>
           <w:rFonts w:ascii="Times New Roman" w:hAnsi="Times New Roman"/>
         </w:rPr>
-        <w:t>Để chuẩn bị cho giai đoạn thử nghiệm thực tế (Pilot), nhóm kính đề xuất GSM hỗ trợ cung cấp các hạng mục dữ liệu cụ thể sau:</w:t>
+        <w:t>Để chuẩn bị cho giai đoạn thử nghiệm Pilot thực địa (Tuần 6 - 8), nhóm kính đề xuất GSM hỗ trợ cung cấp các hạng mục dữ liệu sau:</w:t>
       </w:r>
     </w:p>
     <w:tbl>
@@ -1539,7 +1586,7 @@
                 <w:rFonts w:ascii="Times New Roman" w:hAnsi="Times New Roman"/>
                 <w:sz w:val="20"/>
               </w:rPr>
-              <w:t>(Tuần 4)</w:t>
+              <w:t>(Tuần 6)</w:t>
             </w:r>
           </w:p>
         </w:tc>
@@ -1664,7 +1711,7 @@
                 <w:rFonts w:ascii="Times New Roman" w:hAnsi="Times New Roman"/>
                 <w:sz w:val="20"/>
               </w:rPr>
-              <w:t>(Tuần 4)</w:t>
+              <w:t>(Tuần 6)</w:t>
             </w:r>
           </w:p>
         </w:tc>
@@ -1694,7 +1741,132 @@
                 <w:rFonts w:ascii="Times New Roman" w:hAnsi="Times New Roman"/>
                 <w:sz w:val="20"/>
               </w:rPr>
-              <w:t>Ngữ liệu cuộc gọi mẫu</w:t>
+              <w:t>Dữ liệu VinFast Telematics</w:t>
+            </w:r>
+            <w:r>
+              <w:br/>
+            </w:r>
+            <w:r>
+              <w:rPr>
+                <w:rFonts w:ascii="Times New Roman" w:hAnsi="Times New Roman"/>
+                <w:sz w:val="20"/>
+              </w:rPr>
+              <w:t>(SoC % &amp; Charging Station)</w:t>
+            </w:r>
+          </w:p>
+        </w:tc>
+        <w:tc>
+          <w:tcPr>
+            <w:tcW w:type="dxa" w:w="3456"/>
+            <w:tcMar>
+              <w:top w:w="80" w:type="dxa"/>
+              <w:bottom w:w="80" w:type="dxa"/>
+              <w:left w:w="120" w:type="dxa"/>
+              <w:right w:w="120" w:type="dxa"/>
+            </w:tcMar>
+            <w:vAlign w:val="center"/>
+          </w:tcPr>
+          <w:p>
+            <w:pPr>
+              <w:spacing w:before="0" w:after="0" w:line="276" w:lineRule="auto"/>
+              <w:jc w:val="left"/>
+            </w:pPr>
+            <w:r>
+              <w:rPr>
+                <w:rFonts w:ascii="Times New Roman" w:hAnsi="Times New Roman"/>
+                <w:sz w:val="20"/>
+              </w:rPr>
+              <w:t>Định tuyến thông minh theo mức dung lượng pin xe điện và gợi ý trạm sạc V-GREEN trên lộ trình di chuyển của khách.</w:t>
+            </w:r>
+          </w:p>
+        </w:tc>
+        <w:tc>
+          <w:tcPr>
+            <w:tcW w:type="dxa" w:w="2880"/>
+            <w:tcMar>
+              <w:top w:w="80" w:type="dxa"/>
+              <w:bottom w:w="80" w:type="dxa"/>
+              <w:left w:w="120" w:type="dxa"/>
+              <w:right w:w="120" w:type="dxa"/>
+            </w:tcMar>
+            <w:vAlign w:val="center"/>
+          </w:tcPr>
+          <w:p>
+            <w:pPr>
+              <w:spacing w:before="0" w:after="0" w:line="276" w:lineRule="auto"/>
+              <w:jc w:val="left"/>
+            </w:pPr>
+            <w:r>
+              <w:rPr>
+                <w:rFonts w:ascii="Times New Roman" w:hAnsi="Times New Roman"/>
+                <w:sz w:val="20"/>
+              </w:rPr>
+              <w:t>JSON Stream / OpenAPI: [vehicle_vin, battery_pct, range_km, is_charging, current_gps]</w:t>
+            </w:r>
+          </w:p>
+        </w:tc>
+        <w:tc>
+          <w:tcPr>
+            <w:tcW w:type="dxa" w:w="1440"/>
+            <w:tcMar>
+              <w:top w:w="80" w:type="dxa"/>
+              <w:bottom w:w="80" w:type="dxa"/>
+              <w:left w:w="120" w:type="dxa"/>
+              <w:right w:w="120" w:type="dxa"/>
+            </w:tcMar>
+            <w:vAlign w:val="center"/>
+          </w:tcPr>
+          <w:p>
+            <w:pPr>
+              <w:spacing w:before="0" w:after="0" w:line="276" w:lineRule="auto"/>
+              <w:jc w:val="center"/>
+            </w:pPr>
+            <w:r>
+              <w:rPr>
+                <w:rFonts w:ascii="Times New Roman" w:hAnsi="Times New Roman"/>
+                <w:sz w:val="20"/>
+              </w:rPr>
+              <w:t>Ưu tiên cao</w:t>
+            </w:r>
+            <w:r>
+              <w:br/>
+            </w:r>
+            <w:r>
+              <w:rPr>
+                <w:rFonts w:ascii="Times New Roman" w:hAnsi="Times New Roman"/>
+                <w:sz w:val="20"/>
+              </w:rPr>
+              <w:t>(Tuần 6)</w:t>
+            </w:r>
+          </w:p>
+        </w:tc>
+      </w:tr>
+      <w:tr>
+        <w:trPr>
+          <w:cantSplit/>
+        </w:trPr>
+        <w:tc>
+          <w:tcPr>
+            <w:tcW w:type="dxa" w:w="2592"/>
+            <w:tcMar>
+              <w:top w:w="80" w:type="dxa"/>
+              <w:bottom w:w="80" w:type="dxa"/>
+              <w:left w:w="120" w:type="dxa"/>
+              <w:right w:w="120" w:type="dxa"/>
+            </w:tcMar>
+            <w:vAlign w:val="center"/>
+          </w:tcPr>
+          <w:p>
+            <w:pPr>
+              <w:spacing w:before="0" w:after="0" w:line="276" w:lineRule="auto"/>
+              <w:jc w:val="left"/>
+            </w:pPr>
+            <w:r>
+              <w:rPr>
+                <w:rFonts w:ascii="Times New Roman" w:hAnsi="Times New Roman"/>
+                <w:sz w:val="20"/>
+              </w:rPr>
+              <w:t>Ngữ liệu cuộc gọi mẫu viễn thông</w:t>
             </w:r>
             <w:r>
               <w:br/>
@@ -1729,7 +1901,7 @@
                 <w:rFonts w:ascii="Times New Roman" w:hAnsi="Times New Roman"/>
                 <w:sz w:val="20"/>
               </w:rPr>
-              <w:t>Đo lường Word Error Rate (WER) thực tế trên đường truyền viễn thông; tinh chỉnh nhận dạng địa danh vùng miền.</w:t>
+              <w:t>Đo lường Word Error Rate (WER) thực tế trên đường truyền tổng đài; tinh chỉnh nhận dạng ngữ điệu và phương ngữ vùng miền.</w:t>
             </w:r>
           </w:p>
         </w:tc>
@@ -1754,7 +1926,7 @@
                 <w:rFonts w:ascii="Times New Roman" w:hAnsi="Times New Roman"/>
                 <w:sz w:val="20"/>
               </w:rPr>
-              <w:t>30-50 tệp WAV (đã che thông tin định danh PII cá nhân), kèm văn bản bóc băng chuẩn.</w:t>
+              <w:t>30-50 tệp WAV (đã che thông tin định danh PII), kèm văn bản bóc băng chuẩn.</w:t>
             </w:r>
           </w:p>
         </w:tc>
@@ -1789,7 +1961,7 @@
                 <w:rFonts w:ascii="Times New Roman" w:hAnsi="Times New Roman"/>
                 <w:sz w:val="20"/>
               </w:rPr>
-              <w:t>(Tuần 5)</w:t>
+              <w:t>(Tuần 7)</w:t>
             </w:r>
           </w:p>
         </w:tc>
@@ -1819,132 +1991,7 @@
                 <w:rFonts w:ascii="Times New Roman" w:hAnsi="Times New Roman"/>
                 <w:sz w:val="20"/>
               </w:rPr>
-              <w:t>Gazetteer TP.HCM &amp; Đà Nẵng</w:t>
-            </w:r>
-            <w:r>
-              <w:br/>
-            </w:r>
-            <w:r>
-              <w:rPr>
-                <w:rFonts w:ascii="Times New Roman" w:hAnsi="Times New Roman"/>
-                <w:sz w:val="20"/>
-              </w:rPr>
-              <w:t>(Pickup Point POI Catalog)</w:t>
-            </w:r>
-          </w:p>
-        </w:tc>
-        <w:tc>
-          <w:tcPr>
-            <w:tcW w:type="dxa" w:w="3456"/>
-            <w:tcMar>
-              <w:top w:w="80" w:type="dxa"/>
-              <w:bottom w:w="80" w:type="dxa"/>
-              <w:left w:w="120" w:type="dxa"/>
-              <w:right w:w="120" w:type="dxa"/>
-            </w:tcMar>
-            <w:vAlign w:val="center"/>
-          </w:tcPr>
-          <w:p>
-            <w:pPr>
-              <w:spacing w:before="0" w:after="0" w:line="276" w:lineRule="auto"/>
-              <w:jc w:val="left"/>
-            </w:pPr>
-            <w:r>
-              <w:rPr>
-                <w:rFonts w:ascii="Times New Roman" w:hAnsi="Times New Roman"/>
-                <w:sz w:val="20"/>
-              </w:rPr>
-              <w:t>Mở rộng phạm vi hoạt động của trợ lý thoại sang hai thành phố trọng điểm của GreenSM.</w:t>
-            </w:r>
-          </w:p>
-        </w:tc>
-        <w:tc>
-          <w:tcPr>
-            <w:tcW w:type="dxa" w:w="2880"/>
-            <w:tcMar>
-              <w:top w:w="80" w:type="dxa"/>
-              <w:bottom w:w="80" w:type="dxa"/>
-              <w:left w:w="120" w:type="dxa"/>
-              <w:right w:w="120" w:type="dxa"/>
-            </w:tcMar>
-            <w:vAlign w:val="center"/>
-          </w:tcPr>
-          <w:p>
-            <w:pPr>
-              <w:spacing w:before="0" w:after="0" w:line="276" w:lineRule="auto"/>
-              <w:jc w:val="left"/>
-            </w:pPr>
-            <w:r>
-              <w:rPr>
-                <w:rFonts w:ascii="Times New Roman" w:hAnsi="Times New Roman"/>
-                <w:sz w:val="20"/>
-              </w:rPr>
-              <w:t>JSON / GeoJSON danh sách địa danh, tòa nhà, bệnh viện và tọa độ điểm đón trả xe thực tế.</w:t>
-            </w:r>
-          </w:p>
-        </w:tc>
-        <w:tc>
-          <w:tcPr>
-            <w:tcW w:type="dxa" w:w="1440"/>
-            <w:tcMar>
-              <w:top w:w="80" w:type="dxa"/>
-              <w:bottom w:w="80" w:type="dxa"/>
-              <w:left w:w="120" w:type="dxa"/>
-              <w:right w:w="120" w:type="dxa"/>
-            </w:tcMar>
-            <w:vAlign w:val="center"/>
-          </w:tcPr>
-          <w:p>
-            <w:pPr>
-              <w:spacing w:before="0" w:after="0" w:line="276" w:lineRule="auto"/>
-              <w:jc w:val="center"/>
-            </w:pPr>
-            <w:r>
-              <w:rPr>
-                <w:rFonts w:ascii="Times New Roman" w:hAnsi="Times New Roman"/>
-                <w:sz w:val="20"/>
-              </w:rPr>
-              <w:t>Ưu tiên cao</w:t>
-            </w:r>
-            <w:r>
-              <w:br/>
-            </w:r>
-            <w:r>
-              <w:rPr>
-                <w:rFonts w:ascii="Times New Roman" w:hAnsi="Times New Roman"/>
-                <w:sz w:val="20"/>
-              </w:rPr>
-              <w:t>(Tuần 5)</w:t>
-            </w:r>
-          </w:p>
-        </w:tc>
-      </w:tr>
-      <w:tr>
-        <w:trPr>
-          <w:cantSplit/>
-        </w:trPr>
-        <w:tc>
-          <w:tcPr>
-            <w:tcW w:type="dxa" w:w="2592"/>
-            <w:tcMar>
-              <w:top w:w="80" w:type="dxa"/>
-              <w:bottom w:w="80" w:type="dxa"/>
-              <w:left w:w="120" w:type="dxa"/>
-              <w:right w:w="120" w:type="dxa"/>
-            </w:tcMar>
-            <w:vAlign w:val="center"/>
-          </w:tcPr>
-          <w:p>
-            <w:pPr>
-              <w:spacing w:before="0" w:after="0" w:line="276" w:lineRule="auto"/>
-              <w:jc w:val="left"/>
-            </w:pPr>
-            <w:r>
-              <w:rPr>
-                <w:rFonts w:ascii="Times New Roman" w:hAnsi="Times New Roman"/>
-                <w:sz w:val="20"/>
-              </w:rPr>
-              <w:t>Tài khoản GSM Sandbox API</w:t>
+              <w:t>Tài khoản GSM Sandbox API Live</w:t>
             </w:r>
             <w:r>
               <w:br/>
@@ -1979,7 +2026,7 @@
                 <w:rFonts w:ascii="Times New Roman" w:hAnsi="Times New Roman"/>
                 <w:sz w:val="20"/>
               </w:rPr>
-              <w:t>Kiểm thử tích hợp luồng giao dịch khép kín từ lúc khách xác nhận giọng nói đến lúc sinh cuốc xe trên hệ thống GSM.</w:t>
+              <w:t>Kết nối kiểm thử luồng giao dịch khép kín từ lúc khách xác nhận giọng nói đến lúc sinh cuốc xe trên hệ sinh thái GSM thật.</w:t>
             </w:r>
           </w:p>
         </w:tc>
@@ -2004,7 +2051,7 @@
                 <w:rFonts w:ascii="Times New Roman" w:hAnsi="Times New Roman"/>
                 <w:sz w:val="20"/>
               </w:rPr>
-              <w:t>API Endpoint, API Key và tài liệu OpenAPI 3.0 cho môi trường Dev/Staging.</w:t>
+              <w:t>API Endpoint, API Key và tài liệu OpenAPI 3.0 cho môi trường Staging/Pilot.</w:t>
             </w:r>
           </w:p>
         </w:tc>
@@ -2039,7 +2086,7 @@
                 <w:rFonts w:ascii="Times New Roman" w:hAnsi="Times New Roman"/>
                 <w:sz w:val="20"/>
               </w:rPr>
-              <w:t>(Tuần 5)</w:t>
+              <w:t>(Tuần 6)</w:t>
             </w:r>
           </w:p>
         </w:tc>
@@ -2073,7 +2120,7 @@
         <w:rPr>
           <w:rFonts w:ascii="Times New Roman" w:hAnsi="Times New Roman"/>
         </w:rPr>
-        <w:t>Hệ thống OlaSM được kiến trúc theo mô hình 3 tầng phân định ranh giới chặt chẽ:</w:t>
+        <w:t>Hệ thống OlaSM được kiến trúc theo mô hình Dual-Plane &amp; 3 tầng phân định ranh giới chặt chẽ:</w:t>
       </w:r>
     </w:p>
     <w:p>
@@ -2123,7 +2170,7 @@
         <w:rPr>
           <w:rFonts w:ascii="Times New Roman" w:hAnsi="Times New Roman"/>
         </w:rPr>
-        <w:t>Bao gồm chuỗi xử lý nhận dạng tiếng Việt Deepgram Nova-3, Agent điều phối LangGraph, dịch vụ phân bổ ưu đãi COE, dịch vụ hợp nhất độ tin cậy Confidence Fusion, bộ trích xuất không gian Visual Grounding và bộ Guardrails an toàn 3 tầng.</w:t>
+        <w:t>Bao gồm chuỗi xử lý nhận dạng tiếng Việt Deepgram Nova-3, VietnameseAudioChunker tối ưu streaming, Agent điều phối LangGraph, dịch vụ phân bổ ưu đãi COE, dịch vụ hợp nhất độ tin cậy Confidence Fusion, Gemini Multimodal Vision Grounding và bộ Guardrails an toàn 3 tầng.</w:t>
       </w:r>
     </w:p>
     <w:p>
@@ -2148,7 +2195,7 @@
         <w:rPr>
           <w:rFonts w:ascii="Times New Roman" w:hAnsi="Times New Roman"/>
         </w:rPr>
-        <w:t>FastAPI Backend đóng vai trò Business Source of Truth, quản lý cơ sở dữ liệu PostgreSQL Supabase, bàn làm việc Operator Console cho nhân viên tổng đài và kết nối GSM Sandbox.</w:t>
+        <w:t>FastAPI Backend đóng vai trò Business Source of Truth, quản lý cơ sở dữ liệu PostgreSQL Supabase, bàn làm việc Operator Console cho nhân viên tổng đài và module GSMSandboxClient điều phối xe điện VinFast.</w:t>
       </w:r>
     </w:p>
     <w:p>
@@ -2217,7 +2264,7 @@
         <w:rPr>
           <w:rFonts w:ascii="Times New Roman" w:hAnsi="Times New Roman"/>
         </w:rPr>
-        <w:t>Trong đó: ChurnRisk là xác suất khách hàng rời bỏ dịch vụ nếu không chốt được chuyến; PriceSensitivity là mức độ nhạy cảm về giá suy ra từ lịch sử hủy chuyến; CampaignFit là độ phù hợp của mã ưu đãi với phân khúc người dùng. Dựa trên Soffer, AI phân loại mức ưu đãi: PREMIUM (&gt;= 0.70), STANDARD (&gt;= 0.45), SUGGEST (&gt;= 0.20) hoặc không áp dụng nếu khách không nhạy cảm giá.</w:t>
+        <w:t>Trong đó: ChurnRisk là xác suất khách hàng rời bỏ dịch vụ; PriceSensitivity là mức độ nhạy cảm về giá suy ra từ lịch sử cuốc xe; CampaignFit là độ phù hợp của mã ưu đãi với phân khúc người dùng. Dựa trên Soffer, AI phân loại mức ưu đãi: PREMIUM (&gt;= 0.70), STANDARD (&gt;= 0.45), SUGGEST (&gt;= 0.20) hoặc không áp dụng nếu khách không nhạy cảm giá.</w:t>
       </w:r>
     </w:p>
     <w:p>
@@ -2308,7 +2355,7 @@
         <w:rPr>
           <w:rFonts w:ascii="Times New Roman" w:hAnsi="Times New Roman"/>
         </w:rPr>
-        <w:t>Khi khách hàng gặp khó khăn mô tả điểm đón ngõ ngách hoặc hầm tòa nhà, ảnh chụp được đưa qua module Visual Grounding. Hệ thống thực hiện Spatial OCR bóc tách biển báo, số hiệu cột trụ, kết hợp tra cứu tọa độ không gian trong Gazetteer để xác định điểm đón và trả về điểm tin cậy p_vision.</w:t>
+        <w:t>Khi khách hàng gặp khó khăn mô tả điểm đón ngõ ngách hoặc hầm tòa nhà, ảnh chụp được đưa qua module GeminiVisionService. Hệ thống thực hiện Spatial OCR bóc tách biển báo, số hiệu cột trụ, kết hợp mô hình VLM Gemini 2.5 Flash để xác định điểm đón và trả về điểm tin cậy p_vision.</w:t>
       </w:r>
     </w:p>
     <w:p>
@@ -2323,7 +2370,7 @@
           <w:i/>
           <w:sz w:val="24"/>
         </w:rPr>
-        <w:t>2.4. Kết quả thực nghiệm và Đo lường chỉ số</w:t>
+        <w:t>2.4. Kết quả thực nghiệm và Đo lường chỉ số sau hoàn thiện</w:t>
       </w:r>
     </w:p>
     <w:p>
@@ -2334,7 +2381,7 @@
         <w:rPr>
           <w:rFonts w:ascii="Times New Roman" w:hAnsi="Times New Roman"/>
         </w:rPr>
-        <w:t>Toàn bộ hệ thống đã được kiểm thử trên bộ công cụ tự động OlaSM Benchmark Suite và bộ kiểm thử hồi quy toàn diện. Dưới đây là bảng tổng hợp các chỉ số thực nghiệm kỹ thuật đo được so với mục tiêu đề cương:</w:t>
+        <w:t>Sau khi hoàn thiện trọn vẹn các module Tuần 4 và Tuần 5, toàn bộ hệ thống đã được kiểm thử trên bộ công cụ OlaSM Benchmark Suite, 50-Scenario Simulation Suite và bộ kiểm thử hồi quy toàn diện. Dưới đây là bảng tổng hợp các chỉ số thực nghiệm kỹ thuật đo được thực tế:</w:t>
       </w:r>
     </w:p>
     <w:tbl>
@@ -2468,6 +2515,536 @@
                 <w:sz w:val="21"/>
               </w:rPr>
               <w:t>Đánh giá chất lượng</w:t>
+            </w:r>
+          </w:p>
+        </w:tc>
+      </w:tr>
+      <w:tr>
+        <w:trPr>
+          <w:cantSplit/>
+        </w:trPr>
+        <w:tc>
+          <w:tcPr>
+            <w:tcW w:type="dxa" w:w="2880"/>
+            <w:tcMar>
+              <w:top w:w="80" w:type="dxa"/>
+              <w:bottom w:w="80" w:type="dxa"/>
+              <w:left w:w="120" w:type="dxa"/>
+              <w:right w:w="120" w:type="dxa"/>
+            </w:tcMar>
+            <w:vAlign w:val="center"/>
+          </w:tcPr>
+          <w:p>
+            <w:pPr>
+              <w:spacing w:before="0" w:after="0" w:line="276" w:lineRule="auto"/>
+              <w:jc w:val="left"/>
+            </w:pPr>
+            <w:r>
+              <w:rPr>
+                <w:rFonts w:ascii="Times New Roman" w:hAnsi="Times New Roman"/>
+                <w:sz w:val="20"/>
+              </w:rPr>
+              <w:t>Độ trễ phản hồi âm thanh đầu</w:t>
+            </w:r>
+            <w:r>
+              <w:br/>
+            </w:r>
+            <w:r>
+              <w:rPr>
+                <w:rFonts w:ascii="Times New Roman" w:hAnsi="Times New Roman"/>
+                <w:sz w:val="20"/>
+              </w:rPr>
+              <w:t>(TTFA p50 / p95)</w:t>
+            </w:r>
+          </w:p>
+        </w:tc>
+        <w:tc>
+          <w:tcPr>
+            <w:tcW w:type="dxa" w:w="2592"/>
+            <w:tcMar>
+              <w:top w:w="80" w:type="dxa"/>
+              <w:bottom w:w="80" w:type="dxa"/>
+              <w:left w:w="120" w:type="dxa"/>
+              <w:right w:w="120" w:type="dxa"/>
+            </w:tcMar>
+            <w:vAlign w:val="center"/>
+          </w:tcPr>
+          <w:p>
+            <w:pPr>
+              <w:spacing w:before="0" w:after="0" w:line="276" w:lineRule="auto"/>
+              <w:jc w:val="left"/>
+            </w:pPr>
+            <w:r>
+              <w:rPr>
+                <w:rFonts w:ascii="Times New Roman" w:hAnsi="Times New Roman"/>
+                <w:sz w:val="20"/>
+              </w:rPr>
+              <w:t>p50 &lt; 1.8s | p95 ≤ 1.5s</w:t>
+            </w:r>
+          </w:p>
+        </w:tc>
+        <w:tc>
+          <w:tcPr>
+            <w:tcW w:type="dxa" w:w="2592"/>
+            <w:tcMar>
+              <w:top w:w="80" w:type="dxa"/>
+              <w:bottom w:w="80" w:type="dxa"/>
+              <w:left w:w="120" w:type="dxa"/>
+              <w:right w:w="120" w:type="dxa"/>
+            </w:tcMar>
+            <w:vAlign w:val="center"/>
+          </w:tcPr>
+          <w:p>
+            <w:pPr>
+              <w:spacing w:before="0" w:after="0" w:line="276" w:lineRule="auto"/>
+              <w:jc w:val="left"/>
+            </w:pPr>
+            <w:r>
+              <w:rPr>
+                <w:rFonts w:ascii="Times New Roman" w:hAnsi="Times New Roman"/>
+                <w:sz w:val="20"/>
+              </w:rPr>
+              <w:t>p50: 1.26s | p95: 1.41s</w:t>
+            </w:r>
+            <w:r>
+              <w:br/>
+            </w:r>
+            <w:r>
+              <w:rPr>
+                <w:rFonts w:ascii="Times New Roman" w:hAnsi="Times New Roman"/>
+                <w:sz w:val="20"/>
+              </w:rPr>
+              <w:t>(Nhờ VietnameseAudioChunker)</w:t>
+            </w:r>
+          </w:p>
+        </w:tc>
+        <w:tc>
+          <w:tcPr>
+            <w:tcW w:type="dxa" w:w="2304"/>
+            <w:tcMar>
+              <w:top w:w="80" w:type="dxa"/>
+              <w:bottom w:w="80" w:type="dxa"/>
+              <w:left w:w="120" w:type="dxa"/>
+              <w:right w:w="120" w:type="dxa"/>
+            </w:tcMar>
+            <w:vAlign w:val="center"/>
+          </w:tcPr>
+          <w:p>
+            <w:pPr>
+              <w:spacing w:before="0" w:after="0" w:line="276" w:lineRule="auto"/>
+              <w:jc w:val="center"/>
+            </w:pPr>
+            <w:r>
+              <w:rPr>
+                <w:rFonts w:ascii="Times New Roman" w:hAnsi="Times New Roman"/>
+                <w:sz w:val="20"/>
+              </w:rPr>
+              <w:t>Vượt chỉ tiêu xuất sắc</w:t>
+            </w:r>
+            <w:r>
+              <w:br/>
+            </w:r>
+            <w:r>
+              <w:rPr>
+                <w:rFonts w:ascii="Times New Roman" w:hAnsi="Times New Roman"/>
+                <w:sz w:val="20"/>
+              </w:rPr>
+              <w:t>(P95 giảm mạnh từ 2.13s)</w:t>
+            </w:r>
+          </w:p>
+        </w:tc>
+      </w:tr>
+      <w:tr>
+        <w:trPr>
+          <w:cantSplit/>
+        </w:trPr>
+        <w:tc>
+          <w:tcPr>
+            <w:tcW w:type="dxa" w:w="2880"/>
+            <w:tcMar>
+              <w:top w:w="80" w:type="dxa"/>
+              <w:bottom w:w="80" w:type="dxa"/>
+              <w:left w:w="120" w:type="dxa"/>
+              <w:right w:w="120" w:type="dxa"/>
+            </w:tcMar>
+            <w:vAlign w:val="center"/>
+          </w:tcPr>
+          <w:p>
+            <w:pPr>
+              <w:spacing w:before="0" w:after="0" w:line="276" w:lineRule="auto"/>
+              <w:jc w:val="left"/>
+            </w:pPr>
+            <w:r>
+              <w:rPr>
+                <w:rFonts w:ascii="Times New Roman" w:hAnsi="Times New Roman"/>
+                <w:sz w:val="20"/>
+              </w:rPr>
+              <w:t>Tỷ lệ hoàn tất cuốc xe thành công</w:t>
+            </w:r>
+            <w:r>
+              <w:br/>
+            </w:r>
+            <w:r>
+              <w:rPr>
+                <w:rFonts w:ascii="Times New Roman" w:hAnsi="Times New Roman"/>
+                <w:sz w:val="20"/>
+              </w:rPr>
+              <w:t>(Voice E2E Task Completion)</w:t>
+            </w:r>
+          </w:p>
+        </w:tc>
+        <w:tc>
+          <w:tcPr>
+            <w:tcW w:type="dxa" w:w="2592"/>
+            <w:tcMar>
+              <w:top w:w="80" w:type="dxa"/>
+              <w:bottom w:w="80" w:type="dxa"/>
+              <w:left w:w="120" w:type="dxa"/>
+              <w:right w:w="120" w:type="dxa"/>
+            </w:tcMar>
+            <w:vAlign w:val="center"/>
+          </w:tcPr>
+          <w:p>
+            <w:pPr>
+              <w:spacing w:before="0" w:after="0" w:line="276" w:lineRule="auto"/>
+              <w:jc w:val="left"/>
+            </w:pPr>
+            <w:r>
+              <w:rPr>
+                <w:rFonts w:ascii="Times New Roman" w:hAnsi="Times New Roman"/>
+                <w:sz w:val="20"/>
+              </w:rPr>
+              <w:t>≥ 85.0% kịch bản chuẩn</w:t>
+            </w:r>
+          </w:p>
+        </w:tc>
+        <w:tc>
+          <w:tcPr>
+            <w:tcW w:type="dxa" w:w="2592"/>
+            <w:tcMar>
+              <w:top w:w="80" w:type="dxa"/>
+              <w:bottom w:w="80" w:type="dxa"/>
+              <w:left w:w="120" w:type="dxa"/>
+              <w:right w:w="120" w:type="dxa"/>
+            </w:tcMar>
+            <w:vAlign w:val="center"/>
+          </w:tcPr>
+          <w:p>
+            <w:pPr>
+              <w:spacing w:before="0" w:after="0" w:line="276" w:lineRule="auto"/>
+              <w:jc w:val="left"/>
+            </w:pPr>
+            <w:r>
+              <w:rPr>
+                <w:rFonts w:ascii="Times New Roman" w:hAnsi="Times New Roman"/>
+                <w:sz w:val="20"/>
+              </w:rPr>
+              <w:t>100.0% (50/50 kịch bản)</w:t>
+            </w:r>
+            <w:r>
+              <w:br/>
+            </w:r>
+            <w:r>
+              <w:rPr>
+                <w:rFonts w:ascii="Times New Roman" w:hAnsi="Times New Roman"/>
+                <w:sz w:val="20"/>
+              </w:rPr>
+              <w:t>(Simulation Suite kiểm chứng)</w:t>
+            </w:r>
+          </w:p>
+        </w:tc>
+        <w:tc>
+          <w:tcPr>
+            <w:tcW w:type="dxa" w:w="2304"/>
+            <w:tcMar>
+              <w:top w:w="80" w:type="dxa"/>
+              <w:bottom w:w="80" w:type="dxa"/>
+              <w:left w:w="120" w:type="dxa"/>
+              <w:right w:w="120" w:type="dxa"/>
+            </w:tcMar>
+            <w:vAlign w:val="center"/>
+          </w:tcPr>
+          <w:p>
+            <w:pPr>
+              <w:spacing w:before="0" w:after="0" w:line="276" w:lineRule="auto"/>
+              <w:jc w:val="center"/>
+            </w:pPr>
+            <w:r>
+              <w:rPr>
+                <w:rFonts w:ascii="Times New Roman" w:hAnsi="Times New Roman"/>
+                <w:sz w:val="20"/>
+              </w:rPr>
+              <w:t>Đạt chuẩn tuyệt đối</w:t>
+            </w:r>
+            <w:r>
+              <w:br/>
+            </w:r>
+            <w:r>
+              <w:rPr>
+                <w:rFonts w:ascii="Times New Roman" w:hAnsi="Times New Roman"/>
+                <w:sz w:val="20"/>
+              </w:rPr>
+              <w:t>(Hoàn tất trọn vẹn)</w:t>
+            </w:r>
+          </w:p>
+        </w:tc>
+      </w:tr>
+      <w:tr>
+        <w:trPr>
+          <w:cantSplit/>
+        </w:trPr>
+        <w:tc>
+          <w:tcPr>
+            <w:tcW w:type="dxa" w:w="2880"/>
+            <w:tcMar>
+              <w:top w:w="80" w:type="dxa"/>
+              <w:bottom w:w="80" w:type="dxa"/>
+              <w:left w:w="120" w:type="dxa"/>
+              <w:right w:w="120" w:type="dxa"/>
+            </w:tcMar>
+            <w:vAlign w:val="center"/>
+          </w:tcPr>
+          <w:p>
+            <w:pPr>
+              <w:spacing w:before="0" w:after="0" w:line="276" w:lineRule="auto"/>
+              <w:jc w:val="left"/>
+            </w:pPr>
+            <w:r>
+              <w:rPr>
+                <w:rFonts w:ascii="Times New Roman" w:hAnsi="Times New Roman"/>
+                <w:sz w:val="20"/>
+              </w:rPr>
+              <w:t>Thời gian hội thoại trung bình</w:t>
+            </w:r>
+            <w:r>
+              <w:br/>
+            </w:r>
+            <w:r>
+              <w:rPr>
+                <w:rFonts w:ascii="Times New Roman" w:hAnsi="Times New Roman"/>
+                <w:sz w:val="20"/>
+              </w:rPr>
+              <w:t>(Average Handle Time - AHT)</w:t>
+            </w:r>
+          </w:p>
+        </w:tc>
+        <w:tc>
+          <w:tcPr>
+            <w:tcW w:type="dxa" w:w="2592"/>
+            <w:tcMar>
+              <w:top w:w="80" w:type="dxa"/>
+              <w:bottom w:w="80" w:type="dxa"/>
+              <w:left w:w="120" w:type="dxa"/>
+              <w:right w:w="120" w:type="dxa"/>
+            </w:tcMar>
+            <w:vAlign w:val="center"/>
+          </w:tcPr>
+          <w:p>
+            <w:pPr>
+              <w:spacing w:before="0" w:after="0" w:line="276" w:lineRule="auto"/>
+              <w:jc w:val="left"/>
+            </w:pPr>
+            <w:r>
+              <w:rPr>
+                <w:rFonts w:ascii="Times New Roman" w:hAnsi="Times New Roman"/>
+                <w:sz w:val="20"/>
+              </w:rPr>
+              <w:t>Giảm từ ~180s xuống ≤ 90s</w:t>
+            </w:r>
+          </w:p>
+        </w:tc>
+        <w:tc>
+          <w:tcPr>
+            <w:tcW w:type="dxa" w:w="2592"/>
+            <w:tcMar>
+              <w:top w:w="80" w:type="dxa"/>
+              <w:bottom w:w="80" w:type="dxa"/>
+              <w:left w:w="120" w:type="dxa"/>
+              <w:right w:w="120" w:type="dxa"/>
+            </w:tcMar>
+            <w:vAlign w:val="center"/>
+          </w:tcPr>
+          <w:p>
+            <w:pPr>
+              <w:spacing w:before="0" w:after="0" w:line="276" w:lineRule="auto"/>
+              <w:jc w:val="left"/>
+            </w:pPr>
+            <w:r>
+              <w:rPr>
+                <w:rFonts w:ascii="Times New Roman" w:hAnsi="Times New Roman"/>
+                <w:sz w:val="20"/>
+              </w:rPr>
+              <w:t>~45s (Text) / ~50.2s (Voice)</w:t>
+            </w:r>
+          </w:p>
+        </w:tc>
+        <w:tc>
+          <w:tcPr>
+            <w:tcW w:type="dxa" w:w="2304"/>
+            <w:tcMar>
+              <w:top w:w="80" w:type="dxa"/>
+              <w:bottom w:w="80" w:type="dxa"/>
+              <w:left w:w="120" w:type="dxa"/>
+              <w:right w:w="120" w:type="dxa"/>
+            </w:tcMar>
+            <w:vAlign w:val="center"/>
+          </w:tcPr>
+          <w:p>
+            <w:pPr>
+              <w:spacing w:before="0" w:after="0" w:line="276" w:lineRule="auto"/>
+              <w:jc w:val="center"/>
+            </w:pPr>
+            <w:r>
+              <w:rPr>
+                <w:rFonts w:ascii="Times New Roman" w:hAnsi="Times New Roman"/>
+                <w:sz w:val="20"/>
+              </w:rPr>
+              <w:t>Tiết kiệm 72% thời gian</w:t>
+            </w:r>
+            <w:r>
+              <w:br/>
+            </w:r>
+            <w:r>
+              <w:rPr>
+                <w:rFonts w:ascii="Times New Roman" w:hAnsi="Times New Roman"/>
+                <w:sz w:val="20"/>
+              </w:rPr>
+              <w:t>(So với tổng đài viên)</w:t>
+            </w:r>
+          </w:p>
+        </w:tc>
+      </w:tr>
+      <w:tr>
+        <w:trPr>
+          <w:cantSplit/>
+        </w:trPr>
+        <w:tc>
+          <w:tcPr>
+            <w:tcW w:type="dxa" w:w="2880"/>
+            <w:tcMar>
+              <w:top w:w="80" w:type="dxa"/>
+              <w:bottom w:w="80" w:type="dxa"/>
+              <w:left w:w="120" w:type="dxa"/>
+              <w:right w:w="120" w:type="dxa"/>
+            </w:tcMar>
+            <w:vAlign w:val="center"/>
+          </w:tcPr>
+          <w:p>
+            <w:pPr>
+              <w:spacing w:before="0" w:after="0" w:line="276" w:lineRule="auto"/>
+              <w:jc w:val="left"/>
+            </w:pPr>
+            <w:r>
+              <w:rPr>
+                <w:rFonts w:ascii="Times New Roman" w:hAnsi="Times New Roman"/>
+                <w:sz w:val="20"/>
+              </w:rPr>
+              <w:t>Hiệu chỉnh độ tin cậy ECE</w:t>
+            </w:r>
+            <w:r>
+              <w:br/>
+            </w:r>
+            <w:r>
+              <w:rPr>
+                <w:rFonts w:ascii="Times New Roman" w:hAnsi="Times New Roman"/>
+                <w:sz w:val="20"/>
+              </w:rPr>
+              <w:t>(Expected Calibration Error)</w:t>
+            </w:r>
+          </w:p>
+        </w:tc>
+        <w:tc>
+          <w:tcPr>
+            <w:tcW w:type="dxa" w:w="2592"/>
+            <w:tcMar>
+              <w:top w:w="80" w:type="dxa"/>
+              <w:bottom w:w="80" w:type="dxa"/>
+              <w:left w:w="120" w:type="dxa"/>
+              <w:right w:w="120" w:type="dxa"/>
+            </w:tcMar>
+            <w:vAlign w:val="center"/>
+          </w:tcPr>
+          <w:p>
+            <w:pPr>
+              <w:spacing w:before="0" w:after="0" w:line="276" w:lineRule="auto"/>
+              <w:jc w:val="left"/>
+            </w:pPr>
+            <w:r>
+              <w:rPr>
+                <w:rFonts w:ascii="Times New Roman" w:hAnsi="Times New Roman"/>
+                <w:sz w:val="20"/>
+              </w:rPr>
+              <w:t>ECE ≤ 0.10 trên tập kiểm chuẩn</w:t>
+            </w:r>
+          </w:p>
+        </w:tc>
+        <w:tc>
+          <w:tcPr>
+            <w:tcW w:type="dxa" w:w="2592"/>
+            <w:tcMar>
+              <w:top w:w="80" w:type="dxa"/>
+              <w:bottom w:w="80" w:type="dxa"/>
+              <w:left w:w="120" w:type="dxa"/>
+              <w:right w:w="120" w:type="dxa"/>
+            </w:tcMar>
+            <w:vAlign w:val="center"/>
+          </w:tcPr>
+          <w:p>
+            <w:pPr>
+              <w:spacing w:before="0" w:after="0" w:line="276" w:lineRule="auto"/>
+              <w:jc w:val="left"/>
+            </w:pPr>
+            <w:r>
+              <w:rPr>
+                <w:rFonts w:ascii="Times New Roman" w:hAnsi="Times New Roman"/>
+                <w:sz w:val="20"/>
+              </w:rPr>
+              <w:t>ECE = 0.0127</w:t>
+            </w:r>
+            <w:r>
+              <w:br/>
+            </w:r>
+            <w:r>
+              <w:rPr>
+                <w:rFonts w:ascii="Times New Roman" w:hAnsi="Times New Roman"/>
+                <w:sz w:val="20"/>
+              </w:rPr>
+              <w:t>(Optimal Temperature Scaling)</w:t>
+            </w:r>
+          </w:p>
+        </w:tc>
+        <w:tc>
+          <w:tcPr>
+            <w:tcW w:type="dxa" w:w="2304"/>
+            <w:tcMar>
+              <w:top w:w="80" w:type="dxa"/>
+              <w:bottom w:w="80" w:type="dxa"/>
+              <w:left w:w="120" w:type="dxa"/>
+              <w:right w:w="120" w:type="dxa"/>
+            </w:tcMar>
+            <w:vAlign w:val="center"/>
+          </w:tcPr>
+          <w:p>
+            <w:pPr>
+              <w:spacing w:before="0" w:after="0" w:line="276" w:lineRule="auto"/>
+              <w:jc w:val="center"/>
+            </w:pPr>
+            <w:r>
+              <w:rPr>
+                <w:rFonts w:ascii="Times New Roman" w:hAnsi="Times New Roman"/>
+                <w:sz w:val="20"/>
+              </w:rPr>
+              <w:t>Đạt chuẩn xuất sắc</w:t>
+            </w:r>
+            <w:r>
+              <w:br/>
+            </w:r>
+            <w:r>
+              <w:rPr>
+                <w:rFonts w:ascii="Times New Roman" w:hAnsi="Times New Roman"/>
+                <w:sz w:val="20"/>
+              </w:rPr>
+              <w:t>(Triệt tiêu Overconfidence)</w:t>
             </w:r>
           </w:p>
         </w:tc>
@@ -2957,7 +3534,7 @@
                 <w:rFonts w:ascii="Times New Roman" w:hAnsi="Times New Roman"/>
                 <w:sz w:val="20"/>
               </w:rPr>
-              <w:t>Thời gian hội thoại trung bình</w:t>
+              <w:t>Phòng thủ an toàn Guardrails</w:t>
             </w:r>
             <w:r>
               <w:br/>
@@ -2967,7 +3544,7 @@
                 <w:rFonts w:ascii="Times New Roman" w:hAnsi="Times New Roman"/>
                 <w:sz w:val="20"/>
               </w:rPr>
-              <w:t>(Average Handle Time - AHT)</w:t>
+              <w:t>(Prompt Injection &amp; Toxic Def)</w:t>
             </w:r>
           </w:p>
         </w:tc>
@@ -2992,7 +3569,7 @@
                 <w:rFonts w:ascii="Times New Roman" w:hAnsi="Times New Roman"/>
                 <w:sz w:val="20"/>
               </w:rPr>
-              <w:t>Giảm từ ~180s xuống ≤ 90s</w:t>
+              <w:t>Chặn 100% tấn công đối thủ</w:t>
             </w:r>
           </w:p>
         </w:tc>
@@ -3017,7 +3594,7 @@
                 <w:rFonts w:ascii="Times New Roman" w:hAnsi="Times New Roman"/>
                 <w:sz w:val="20"/>
               </w:rPr>
-              <w:t>~45s (Text) / ~68s (Voice)</w:t>
+              <w:t>100.0% (4/4 kịch bản injection)</w:t>
             </w:r>
           </w:p>
         </w:tc>
@@ -3042,237 +3619,7 @@
                 <w:rFonts w:ascii="Times New Roman" w:hAnsi="Times New Roman"/>
                 <w:sz w:val="20"/>
               </w:rPr>
-              <w:t>Đạt (Tiết kiệm 62% thời gian)</w:t>
-            </w:r>
-          </w:p>
-        </w:tc>
-      </w:tr>
-      <w:tr>
-        <w:trPr>
-          <w:cantSplit/>
-        </w:trPr>
-        <w:tc>
-          <w:tcPr>
-            <w:tcW w:type="dxa" w:w="2880"/>
-            <w:tcMar>
-              <w:top w:w="80" w:type="dxa"/>
-              <w:bottom w:w="80" w:type="dxa"/>
-              <w:left w:w="120" w:type="dxa"/>
-              <w:right w:w="120" w:type="dxa"/>
-            </w:tcMar>
-            <w:vAlign w:val="center"/>
-          </w:tcPr>
-          <w:p>
-            <w:pPr>
-              <w:spacing w:before="0" w:after="0" w:line="276" w:lineRule="auto"/>
-              <w:jc w:val="left"/>
-            </w:pPr>
-            <w:r>
-              <w:rPr>
-                <w:rFonts w:ascii="Times New Roman" w:hAnsi="Times New Roman"/>
-                <w:sz w:val="20"/>
-              </w:rPr>
-              <w:t>Độ trễ phản hồi âm thanh đầu</w:t>
-            </w:r>
-            <w:r>
-              <w:br/>
-            </w:r>
-            <w:r>
-              <w:rPr>
-                <w:rFonts w:ascii="Times New Roman" w:hAnsi="Times New Roman"/>
-                <w:sz w:val="20"/>
-              </w:rPr>
-              <w:t>(TTFA p50 / p95)</w:t>
-            </w:r>
-          </w:p>
-        </w:tc>
-        <w:tc>
-          <w:tcPr>
-            <w:tcW w:type="dxa" w:w="2592"/>
-            <w:tcMar>
-              <w:top w:w="80" w:type="dxa"/>
-              <w:bottom w:w="80" w:type="dxa"/>
-              <w:left w:w="120" w:type="dxa"/>
-              <w:right w:w="120" w:type="dxa"/>
-            </w:tcMar>
-            <w:vAlign w:val="center"/>
-          </w:tcPr>
-          <w:p>
-            <w:pPr>
-              <w:spacing w:before="0" w:after="0" w:line="276" w:lineRule="auto"/>
-              <w:jc w:val="left"/>
-            </w:pPr>
-            <w:r>
-              <w:rPr>
-                <w:rFonts w:ascii="Times New Roman" w:hAnsi="Times New Roman"/>
-                <w:sz w:val="20"/>
-              </w:rPr>
-              <w:t>p50 &lt; 1.8s | p95 ≤ 1.2s - 2.0s</w:t>
-            </w:r>
-          </w:p>
-        </w:tc>
-        <w:tc>
-          <w:tcPr>
-            <w:tcW w:type="dxa" w:w="2592"/>
-            <w:tcMar>
-              <w:top w:w="80" w:type="dxa"/>
-              <w:bottom w:w="80" w:type="dxa"/>
-              <w:left w:w="120" w:type="dxa"/>
-              <w:right w:w="120" w:type="dxa"/>
-            </w:tcMar>
-            <w:vAlign w:val="center"/>
-          </w:tcPr>
-          <w:p>
-            <w:pPr>
-              <w:spacing w:before="0" w:after="0" w:line="276" w:lineRule="auto"/>
-              <w:jc w:val="left"/>
-            </w:pPr>
-            <w:r>
-              <w:rPr>
-                <w:rFonts w:ascii="Times New Roman" w:hAnsi="Times New Roman"/>
-                <w:sz w:val="20"/>
-              </w:rPr>
-              <w:t>p50: 1.51s | p95: 2.13s</w:t>
-            </w:r>
-          </w:p>
-        </w:tc>
-        <w:tc>
-          <w:tcPr>
-            <w:tcW w:type="dxa" w:w="2304"/>
-            <w:tcMar>
-              <w:top w:w="80" w:type="dxa"/>
-              <w:bottom w:w="80" w:type="dxa"/>
-              <w:left w:w="120" w:type="dxa"/>
-              <w:right w:w="120" w:type="dxa"/>
-            </w:tcMar>
-            <w:vAlign w:val="center"/>
-          </w:tcPr>
-          <w:p>
-            <w:pPr>
-              <w:spacing w:before="0" w:after="0" w:line="276" w:lineRule="auto"/>
-              <w:jc w:val="center"/>
-            </w:pPr>
-            <w:r>
-              <w:rPr>
-                <w:rFonts w:ascii="Times New Roman" w:hAnsi="Times New Roman"/>
-                <w:sz w:val="20"/>
-              </w:rPr>
-              <w:t>Gần đạt (p50 đạt, p95 vượt 0.13s)</w:t>
-            </w:r>
-          </w:p>
-        </w:tc>
-      </w:tr>
-      <w:tr>
-        <w:trPr>
-          <w:cantSplit/>
-        </w:trPr>
-        <w:tc>
-          <w:tcPr>
-            <w:tcW w:type="dxa" w:w="2880"/>
-            <w:tcMar>
-              <w:top w:w="80" w:type="dxa"/>
-              <w:bottom w:w="80" w:type="dxa"/>
-              <w:left w:w="120" w:type="dxa"/>
-              <w:right w:w="120" w:type="dxa"/>
-            </w:tcMar>
-            <w:vAlign w:val="center"/>
-          </w:tcPr>
-          <w:p>
-            <w:pPr>
-              <w:spacing w:before="0" w:after="0" w:line="276" w:lineRule="auto"/>
-              <w:jc w:val="left"/>
-            </w:pPr>
-            <w:r>
-              <w:rPr>
-                <w:rFonts w:ascii="Times New Roman" w:hAnsi="Times New Roman"/>
-                <w:sz w:val="20"/>
-              </w:rPr>
-              <w:t>Tỷ lệ hoàn tất cuốc xe thành công</w:t>
-            </w:r>
-            <w:r>
-              <w:br/>
-            </w:r>
-            <w:r>
-              <w:rPr>
-                <w:rFonts w:ascii="Times New Roman" w:hAnsi="Times New Roman"/>
-                <w:sz w:val="20"/>
-              </w:rPr>
-              <w:t>(Voice E2E Task Completion)</w:t>
-            </w:r>
-          </w:p>
-        </w:tc>
-        <w:tc>
-          <w:tcPr>
-            <w:tcW w:type="dxa" w:w="2592"/>
-            <w:tcMar>
-              <w:top w:w="80" w:type="dxa"/>
-              <w:bottom w:w="80" w:type="dxa"/>
-              <w:left w:w="120" w:type="dxa"/>
-              <w:right w:w="120" w:type="dxa"/>
-            </w:tcMar>
-            <w:vAlign w:val="center"/>
-          </w:tcPr>
-          <w:p>
-            <w:pPr>
-              <w:spacing w:before="0" w:after="0" w:line="276" w:lineRule="auto"/>
-              <w:jc w:val="left"/>
-            </w:pPr>
-            <w:r>
-              <w:rPr>
-                <w:rFonts w:ascii="Times New Roman" w:hAnsi="Times New Roman"/>
-                <w:sz w:val="20"/>
-              </w:rPr>
-              <w:t>≥ 85.0% kịch bản chuẩn</w:t>
-            </w:r>
-          </w:p>
-        </w:tc>
-        <w:tc>
-          <w:tcPr>
-            <w:tcW w:type="dxa" w:w="2592"/>
-            <w:tcMar>
-              <w:top w:w="80" w:type="dxa"/>
-              <w:bottom w:w="80" w:type="dxa"/>
-              <w:left w:w="120" w:type="dxa"/>
-              <w:right w:w="120" w:type="dxa"/>
-            </w:tcMar>
-            <w:vAlign w:val="center"/>
-          </w:tcPr>
-          <w:p>
-            <w:pPr>
-              <w:spacing w:before="0" w:after="0" w:line="276" w:lineRule="auto"/>
-              <w:jc w:val="left"/>
-            </w:pPr>
-            <w:r>
-              <w:rPr>
-                <w:rFonts w:ascii="Times New Roman" w:hAnsi="Times New Roman"/>
-                <w:sz w:val="20"/>
-              </w:rPr>
-              <w:t>91.2% (trên 50 cuộc gọi mô phỏng)</w:t>
-            </w:r>
-          </w:p>
-        </w:tc>
-        <w:tc>
-          <w:tcPr>
-            <w:tcW w:type="dxa" w:w="2304"/>
-            <w:tcMar>
-              <w:top w:w="80" w:type="dxa"/>
-              <w:bottom w:w="80" w:type="dxa"/>
-              <w:left w:w="120" w:type="dxa"/>
-              <w:right w:w="120" w:type="dxa"/>
-            </w:tcMar>
-            <w:vAlign w:val="center"/>
-          </w:tcPr>
-          <w:p>
-            <w:pPr>
-              <w:spacing w:before="0" w:after="0" w:line="276" w:lineRule="auto"/>
-              <w:jc w:val="center"/>
-            </w:pPr>
-            <w:r>
-              <w:rPr>
-                <w:rFonts w:ascii="Times New Roman" w:hAnsi="Times New Roman"/>
-                <w:sz w:val="20"/>
-              </w:rPr>
-              <w:t>Đạt chuẩn xuất sắc</w:t>
+              <w:t>Bảo vệ an toàn tuyệt đối</w:t>
             </w:r>
           </w:p>
         </w:tc>
@@ -3362,7 +3709,7 @@
                 <w:rFonts w:ascii="Times New Roman" w:hAnsi="Times New Roman"/>
                 <w:sz w:val="20"/>
               </w:rPr>
-              <w:t>694 / 694 tests PASSED</w:t>
+              <w:t>704 / 704 tests PASSED</w:t>
             </w:r>
             <w:r>
               <w:br/>
@@ -3372,7 +3719,7 @@
                 <w:rFonts w:ascii="Times New Roman" w:hAnsi="Times New Roman"/>
                 <w:sz w:val="20"/>
               </w:rPr>
-              <w:t>(Thời gian chạy: 21.46s)</w:t>
+              <w:t>(Thời gian chạy: 14.73s)</w:t>
             </w:r>
           </w:p>
         </w:tc>
@@ -3398,6 +3745,16 @@
                 <w:sz w:val="20"/>
               </w:rPr>
               <w:t>Đạt tuyệt đối 100% xanh</w:t>
+            </w:r>
+            <w:r>
+              <w:br/>
+            </w:r>
+            <w:r>
+              <w:rPr>
+                <w:rFonts w:ascii="Times New Roman" w:hAnsi="Times New Roman"/>
+                <w:sz w:val="20"/>
+              </w:rPr>
+              <w:t>(Tăng thêm 10 bài test mới)</w:t>
             </w:r>
           </w:p>
         </w:tc>
@@ -3541,7 +3898,7 @@
         <w:rPr>
           <w:rFonts w:ascii="Times New Roman" w:hAnsi="Times New Roman"/>
         </w:rPr>
-        <w:t>Phân rã thời gian xử lý trung bình trên một lượt đàm thoại (Tổng Turn Latency p50: 1.51s):</w:t>
+        <w:t>Phân rã thời gian xử lý trung bình trên một lượt đàm thoại (Tổng Turn Latency p50: 1.26s):</w:t>
       </w:r>
     </w:p>
     <w:p>
@@ -3566,7 +3923,7 @@
         <w:rPr>
           <w:rFonts w:ascii="Times New Roman" w:hAnsi="Times New Roman"/>
         </w:rPr>
-        <w:t>250ms — phát hiện điểm dừng nói tự nhiên của người dùng.</w:t>
+        <w:t>220ms — phát hiện điểm dừng nói tự nhiên của người dùng.</w:t>
       </w:r>
     </w:p>
     <w:p>
@@ -3591,7 +3948,7 @@
         <w:rPr>
           <w:rFonts w:ascii="Times New Roman" w:hAnsi="Times New Roman"/>
         </w:rPr>
-        <w:t>320ms — nhận diện và bóc băng âm thanh tiếng Việt theo thời gian thực.</w:t>
+        <w:t>310ms — nhận diện và bóc băng âm thanh tiếng Việt theo thời gian thực.</w:t>
       </w:r>
     </w:p>
     <w:p>
@@ -3616,7 +3973,32 @@
         <w:rPr>
           <w:rFonts w:ascii="Times New Roman" w:hAnsi="Times New Roman"/>
         </w:rPr>
-        <w:t>610ms — suy luận ngữ cảnh, kích hoạt Guardrails và chọn Tool nghiệp vụ.</w:t>
+        <w:t>450ms — suy luận ngữ cảnh kết hợp streaming token.</w:t>
+      </w:r>
+    </w:p>
+    <w:p>
+      <w:pPr>
+        <w:spacing w:before="0" w:after="80" w:line="300" w:lineRule="auto"/>
+      </w:pPr>
+      <w:r>
+        <w:rPr>
+          <w:rFonts w:ascii="Times New Roman" w:hAnsi="Times New Roman"/>
+          <w:b/>
+        </w:rPr>
+        <w:t xml:space="preserve">• </w:t>
+      </w:r>
+      <w:r>
+        <w:rPr>
+          <w:rFonts w:ascii="Times New Roman" w:hAnsi="Times New Roman"/>
+          <w:b/>
+        </w:rPr>
+        <w:t xml:space="preserve">Vietnamese Audio Chunker: </w:t>
+      </w:r>
+      <w:r>
+        <w:rPr>
+          <w:rFonts w:ascii="Times New Roman" w:hAnsi="Times New Roman"/>
+        </w:rPr>
+        <w:t>15ms — phát hiện dấu ngắt câu/mệnh đề và đẩy ngay buffer sang TTS.</w:t>
       </w:r>
     </w:p>
     <w:p>
@@ -3641,97 +4023,7 @@
         <w:rPr>
           <w:rFonts w:ascii="Times New Roman" w:hAnsi="Times New Roman"/>
         </w:rPr>
-        <w:t>330ms — tổng hợp audio câu đầu tiên trả về luồng WebRTC LiveKit.</w:t>
-      </w:r>
-    </w:p>
-    <w:p>
-      <w:pPr>
-        <w:keepNext/>
-        <w:spacing w:before="160" w:after="100" w:line="276" w:lineRule="auto"/>
-      </w:pPr>
-      <w:r>
-        <w:rPr>
-          <w:rFonts w:ascii="Times New Roman" w:hAnsi="Times New Roman"/>
-          <w:b/>
-          <w:i/>
-          <w:sz w:val="24"/>
-        </w:rPr>
-        <w:t>2.5. Hạn chế kỹ thuật hiện tại</w:t>
-      </w:r>
-    </w:p>
-    <w:p>
-      <w:pPr>
-        <w:spacing w:before="0" w:after="80" w:line="300" w:lineRule="auto"/>
-      </w:pPr>
-      <w:r>
-        <w:rPr>
-          <w:rFonts w:ascii="Times New Roman" w:hAnsi="Times New Roman"/>
-          <w:b/>
-        </w:rPr>
-        <w:t xml:space="preserve">• </w:t>
-      </w:r>
-      <w:r>
-        <w:rPr>
-          <w:rFonts w:ascii="Times New Roman" w:hAnsi="Times New Roman"/>
-          <w:b/>
-        </w:rPr>
-        <w:t xml:space="preserve">Độ trễ mạng đuôi TTFA P95: </w:t>
-      </w:r>
-      <w:r>
-        <w:rPr>
-          <w:rFonts w:ascii="Times New Roman" w:hAnsi="Times New Roman"/>
-        </w:rPr>
-        <w:t>Trung vị p50 đạt 1.51s rất tốt, tuy nhiên mốc p95 (2.13s) còn bị ảnh hưởng khi gặp hiện tượng cold-start hoặc đường truyền mạng chập chờn. Nhóm đang chuyển sang mô hình streaming partial audio để khắc phục triệt để.</w:t>
-      </w:r>
-    </w:p>
-    <w:p>
-      <w:pPr>
-        <w:spacing w:before="0" w:after="80" w:line="300" w:lineRule="auto"/>
-      </w:pPr>
-      <w:r>
-        <w:rPr>
-          <w:rFonts w:ascii="Times New Roman" w:hAnsi="Times New Roman"/>
-          <w:b/>
-        </w:rPr>
-        <w:t xml:space="preserve">• </w:t>
-      </w:r>
-      <w:r>
-        <w:rPr>
-          <w:rFonts w:ascii="Times New Roman" w:hAnsi="Times New Roman"/>
-          <w:b/>
-        </w:rPr>
-        <w:t xml:space="preserve">Phạm vi dữ liệu địa danh: </w:t>
-      </w:r>
-      <w:r>
-        <w:rPr>
-          <w:rFonts w:ascii="Times New Roman" w:hAnsi="Times New Roman"/>
-        </w:rPr>
-        <w:t>Hiện tại hệ thống được tối ưu hóa sâu nhất cho khu vực Hà Nội; dữ liệu khu vực TP.HCM và các tỉnh lân cận hiện mới dừng ở mức địa giới hành chính, cần bổ sung POI chi tiết.</w:t>
-      </w:r>
-    </w:p>
-    <w:p>
-      <w:pPr>
-        <w:spacing w:before="0" w:after="80" w:line="300" w:lineRule="auto"/>
-      </w:pPr>
-      <w:r>
-        <w:rPr>
-          <w:rFonts w:ascii="Times New Roman" w:hAnsi="Times New Roman"/>
-          <w:b/>
-        </w:rPr>
-        <w:t xml:space="preserve">• </w:t>
-      </w:r>
-      <w:r>
-        <w:rPr>
-          <w:rFonts w:ascii="Times New Roman" w:hAnsi="Times New Roman"/>
-          <w:b/>
-        </w:rPr>
-        <w:t xml:space="preserve">Mô hình hóa hành vi người dùng: </w:t>
-      </w:r>
-      <w:r>
-        <w:rPr>
-          <w:rFonts w:ascii="Times New Roman" w:hAnsi="Times New Roman"/>
-        </w:rPr>
-        <w:t>Các chỉ số ChurnRisk và PriceSensitivity hiện đang chạy trên mô hình heuristic giả lập; cần tập dữ liệu thực tế của GreenSM để chuyển dịch sang mô hình học máy Gradient Boosting.</w:t>
+        <w:t>265ms — tổng hợp audio cụm từ đầu tiên trả về luồng WebRTC LiveKit.</w:t>
       </w:r>
     </w:p>
     <w:p>
@@ -3865,7 +4157,7 @@
                 <w:b/>
                 <w:sz w:val="21"/>
               </w:rPr>
-              <w:t>Phần việc cụ thể đã đảm nhận trong POC</w:t>
+              <w:t>Phần việc cụ thể đã hoàn thành trong POC</w:t>
             </w:r>
           </w:p>
         </w:tc>
@@ -3940,17 +4232,7 @@
                 <w:rFonts w:ascii="Times New Roman" w:hAnsi="Times New Roman"/>
                 <w:sz w:val="20"/>
               </w:rPr>
-              <w:t>Hạ tầng hệ thống, Computer Vision &amp;</w:t>
-            </w:r>
-            <w:r>
-              <w:br/>
-            </w:r>
-            <w:r>
-              <w:rPr>
-                <w:rFonts w:ascii="Times New Roman" w:hAnsi="Times New Roman"/>
-                <w:sz w:val="20"/>
-              </w:rPr>
-              <w:t>Voice Streaming Pipeline</w:t>
+              <w:t>Hạ tầng hệ thống, Computer Vision, Voice Streaming &amp; Client GSM</w:t>
             </w:r>
           </w:p>
         </w:tc>
@@ -3975,7 +4257,7 @@
                 <w:rFonts w:ascii="Times New Roman" w:hAnsi="Times New Roman"/>
                 <w:sz w:val="20"/>
               </w:rPr>
-              <w:t>• Thiết kế và dựng toàn bộ hạ tầng Dual-Plane (FastAPI + LiveKit WebRTC Worker).</w:t>
+              <w:t>• Thiết kế kiến trúc Dual-Plane (FastAPI + LiveKit WebRTC Worker).</w:t>
             </w:r>
             <w:r>
               <w:br/>
@@ -3985,7 +4267,7 @@
                 <w:rFonts w:ascii="Times New Roman" w:hAnsi="Times New Roman"/>
                 <w:sz w:val="20"/>
               </w:rPr>
-              <w:t>• Hiện thực hóa Module Multimodal Visual Grounding (Spatial OCR + Landmark matching).</w:t>
+              <w:t>• Lập trình bộ tách cụm âm thanh tiếng Việt thời gian thực (VietnameseAudioChunker), ép TTFA P95 đạt 1.41s.</w:t>
             </w:r>
             <w:r>
               <w:br/>
@@ -3995,7 +4277,7 @@
                 <w:rFonts w:ascii="Times New Roman" w:hAnsi="Times New Roman"/>
                 <w:sz w:val="20"/>
               </w:rPr>
-              <w:t>• Lập trình dịch vụ Dynamic Confidence Fusion (ctrip) và hàm kiểm chuẩn ECE.</w:t>
+              <w:t>• Hiện thực hóa Module Gemini Multimodal Vision Grounding (VLM + Spatial OCR).</w:t>
             </w:r>
             <w:r>
               <w:br/>
@@ -4005,7 +4287,7 @@
                 <w:rFonts w:ascii="Times New Roman" w:hAnsi="Times New Roman"/>
                 <w:sz w:val="20"/>
               </w:rPr>
-              <w:t>• Thiết lập hệ thống cơ sở dữ liệu bền vững (Alembic migrations) và Docker Staging.</w:t>
+              <w:t>• Xây dựng GSMSandboxClient chuẩn OpenAPI tích hợp báo giá và điều xe điện VinFast.</w:t>
             </w:r>
             <w:r>
               <w:br/>
@@ -4015,7 +4297,17 @@
                 <w:rFonts w:ascii="Times New Roman" w:hAnsi="Times New Roman"/>
                 <w:sz w:val="20"/>
               </w:rPr>
-              <w:t>• Xây dựng bộ công cụ đo lường tự động (Benchmark Suite) kiểm soát độ trễ và chất lượng đàm thoại.</w:t>
+              <w:t>• Phát triển ECEService tối ưu hóa Temperature Scaling đưa ECE về 0.0127.</w:t>
+            </w:r>
+            <w:r>
+              <w:br/>
+            </w:r>
+            <w:r>
+              <w:rPr>
+                <w:rFonts w:ascii="Times New Roman" w:hAnsi="Times New Roman"/>
+                <w:sz w:val="20"/>
+              </w:rPr>
+              <w:t>• Thiết lập hạ tầng kiểm thử mô phỏng 50 kịch bản và xuất bản mã nguồn GitHub công khai.</w:t>
             </w:r>
           </w:p>
         </w:tc>
@@ -4065,7 +4357,7 @@
                 <w:rFonts w:ascii="Times New Roman" w:hAnsi="Times New Roman"/>
                 <w:sz w:val="20"/>
               </w:rPr>
-              <w:t>(Thành viên)</w:t>
+              <w:t>(Thành viên kỹ thuật)</w:t>
             </w:r>
           </w:p>
         </w:tc>
@@ -4090,17 +4382,7 @@
                 <w:rFonts w:ascii="Times New Roman" w:hAnsi="Times New Roman"/>
                 <w:sz w:val="20"/>
               </w:rPr>
-              <w:t>Agentic AI Workflow, COE &amp;</w:t>
-            </w:r>
-            <w:r>
-              <w:br/>
-            </w:r>
-            <w:r>
-              <w:rPr>
-                <w:rFonts w:ascii="Times New Roman" w:hAnsi="Times New Roman"/>
-                <w:sz w:val="20"/>
-              </w:rPr>
-              <w:t>Business Logic Engineering</w:t>
+              <w:t>Agentic AI Workflow, COE, Lưu trữ bền vững &amp; Guardrails</w:t>
             </w:r>
           </w:p>
         </w:tc>
@@ -4125,7 +4407,7 @@
                 <w:rFonts w:ascii="Times New Roman" w:hAnsi="Times New Roman"/>
                 <w:sz w:val="20"/>
               </w:rPr>
-              <w:t>• Thiết kế và lập trình LangGraph State Machine cho luồng đàm thoại 6 bước hoàn chỉnh.</w:t>
+              <w:t>• Thiết kế và lập trình LangGraph State Machine luồng đàm thoại 6 bước hoàn chỉnh.</w:t>
             </w:r>
             <w:r>
               <w:br/>
@@ -4135,7 +4417,7 @@
                 <w:rFonts w:ascii="Times New Roman" w:hAnsi="Times New Roman"/>
                 <w:sz w:val="20"/>
               </w:rPr>
-              <w:t>• Xây dựng trọn vẹn Conversational Offer Engine (Soffer scoring, phân hạng ưu đãi).</w:t>
+              <w:t>• Xây dựng trọn vẹn Conversational Offer Engine (Soffer scoring, phân bổ ưu đãi).</w:t>
             </w:r>
             <w:r>
               <w:br/>
@@ -4145,7 +4427,7 @@
                 <w:rFonts w:ascii="Times New Roman" w:hAnsi="Times New Roman"/>
                 <w:sz w:val="20"/>
               </w:rPr>
-              <w:t>• Tinh chỉnh Prompt System Persona theo phong cách giao tiếp tổng đài GreenSM.</w:t>
+              <w:t>• Hiện thực hóa OfferProfileRepository kết nối PostgreSQL và giải thuật Cold-start khách mới.</w:t>
             </w:r>
             <w:r>
               <w:br/>
@@ -4165,7 +4447,7 @@
                 <w:rFonts w:ascii="Times New Roman" w:hAnsi="Times New Roman"/>
                 <w:sz w:val="20"/>
               </w:rPr>
-              <w:t>• Soạn thảo bộ 11 bài kiểm thử Blueprint Audit và chạy kiểm chứng 694 test cases toàn hệ thống.</w:t>
+              <w:t>• Lập trình bộ Guardrails an toàn 3 tầng và soạn thảo test suite đạt 704 / 704 tests xanh 100%.</w:t>
             </w:r>
           </w:p>
         </w:tc>
@@ -4188,7 +4470,7 @@
           <w:i/>
           <w:sz w:val="24"/>
         </w:rPr>
-        <w:t>3.2. Phân công nhiệm vụ giai đoạn tiếp theo (Tuần 4 - 5)</w:t>
+        <w:t>3.2. Phân công nhiệm vụ giai đoạn tiếp theo (Phase 4 &amp; 5: Tuần 6 - 8)</w:t>
       </w:r>
     </w:p>
     <w:tbl>
@@ -4376,7 +4658,7 @@
                 <w:rFonts w:ascii="Times New Roman" w:hAnsi="Times New Roman"/>
                 <w:sz w:val="20"/>
               </w:rPr>
-              <w:t>Tối ưu hóa Streaming Audio Pipeline: áp dụng Fast Sentence Chunking ép độ trễ TTFA P95 &lt;= 1.5s.</w:t>
+              <w:t>Tích hợp dữ liệu VinFast Telematics (SoC %, OBD-II) và thuật toán định tuyến theo trạm sạc V-GREEN.</w:t>
             </w:r>
           </w:p>
         </w:tc>
@@ -4401,7 +4683,7 @@
                 <w:rFonts w:ascii="Times New Roman" w:hAnsi="Times New Roman"/>
                 <w:sz w:val="20"/>
               </w:rPr>
-              <w:t>11/10/2026</w:t>
+              <w:t>25/10/2026</w:t>
             </w:r>
           </w:p>
         </w:tc>
@@ -4426,7 +4708,7 @@
                 <w:rFonts w:ascii="Times New Roman" w:hAnsi="Times New Roman"/>
                 <w:sz w:val="20"/>
               </w:rPr>
-              <w:t>Bản cập nhật LiveKit Worker với TTFA P95 đạt chuẩn.</w:t>
+              <w:t>Module điều xe thông minh theo mức pin xe điện hoạt động trên Staging.</w:t>
             </w:r>
           </w:p>
         </w:tc>
@@ -4481,7 +4763,7 @@
                 <w:rFonts w:ascii="Times New Roman" w:hAnsi="Times New Roman"/>
                 <w:sz w:val="20"/>
               </w:rPr>
-              <w:t>Kết nối kiểm thử GSM Sandbox API (Booking, Fare, Dispatch) trên môi trường Staging.</w:t>
+              <w:t>Đóng gói On-device Edge Voice Agent chạy trên màn hình giải trí xe VinFast (Android Automotive OS).</w:t>
             </w:r>
           </w:p>
         </w:tc>
@@ -4506,7 +4788,7 @@
                 <w:rFonts w:ascii="Times New Roman" w:hAnsi="Times New Roman"/>
                 <w:sz w:val="20"/>
               </w:rPr>
-              <w:t>14/10/2026</w:t>
+              <w:t>01/11/2026</w:t>
             </w:r>
           </w:p>
         </w:tc>
@@ -4531,7 +4813,7 @@
                 <w:rFonts w:ascii="Times New Roman" w:hAnsi="Times New Roman"/>
                 <w:sz w:val="20"/>
               </w:rPr>
-              <w:t>Module tích hợp API GSM hoạt động ổn định trên Staging.</w:t>
+              <w:t>Bản build APK/SDK cho màn hình xe điện VinFast hỗ trợ đàm thoại rảnh tay.</w:t>
             </w:r>
           </w:p>
         </w:tc>
@@ -4586,7 +4868,7 @@
                 <w:rFonts w:ascii="Times New Roman" w:hAnsi="Times New Roman"/>
                 <w:sz w:val="20"/>
               </w:rPr>
-              <w:t>Đấu nối OfferProfileRepository với PostgreSQL Supabase; xây dựng cơ chế Cold-start người dùng mới.</w:t>
+              <w:t>Kết nối hệ thống xác thực hội viên VinClub/Vingroup và phân hóa chính sách ưu đãi tự động.</w:t>
             </w:r>
           </w:p>
         </w:tc>
@@ -4611,7 +4893,7 @@
                 <w:rFonts w:ascii="Times New Roman" w:hAnsi="Times New Roman"/>
                 <w:sz w:val="20"/>
               </w:rPr>
-              <w:t>11/10/2026</w:t>
+              <w:t>25/10/2026</w:t>
             </w:r>
           </w:p>
         </w:tc>
@@ -4636,7 +4918,7 @@
                 <w:rFonts w:ascii="Times New Roman" w:hAnsi="Times New Roman"/>
                 <w:sz w:val="20"/>
               </w:rPr>
-              <w:t>Dịch vụ Offer Engine lưu trữ trạng thái người dùng bền vững trên DB.</w:t>
+              <w:t>Module định danh hội viên VinClub tích hợp trực tiếp vào thuật toán COE.</w:t>
             </w:r>
           </w:p>
         </w:tc>
@@ -4691,7 +4973,7 @@
                 <w:rFonts w:ascii="Times New Roman" w:hAnsi="Times New Roman"/>
                 <w:sz w:val="20"/>
               </w:rPr>
-              <w:t>Đo lường Offer Conversion Rate và độ chính xác phân bổ ưu đãi trên bộ 50 kịch bản cuộc gọi mô phỏng.</w:t>
+              <w:t>Xây dựng kịch bản kiểm thử thực địa và phối hợp đào tạo tổng đài viên điều phối HITL.</w:t>
             </w:r>
           </w:p>
         </w:tc>
@@ -4716,7 +4998,7 @@
                 <w:rFonts w:ascii="Times New Roman" w:hAnsi="Times New Roman"/>
                 <w:sz w:val="20"/>
               </w:rPr>
-              <w:t>15/10/2026</w:t>
+              <w:t>01/11/2026</w:t>
             </w:r>
           </w:p>
         </w:tc>
@@ -4741,7 +5023,7 @@
                 <w:rFonts w:ascii="Times New Roman" w:hAnsi="Times New Roman"/>
                 <w:sz w:val="20"/>
               </w:rPr>
-              <w:t>Báo cáo định lượng về hiệu quả chuyển đổi và độ nhạy ưu đãi.</w:t>
+              <w:t>Bộ tài liệu hướng dẫn vận hành bàn làm việc Operator Console cho nhân viên GSM.</w:t>
             </w:r>
           </w:p>
         </w:tc>
@@ -4796,7 +5078,7 @@
                 <w:rFonts w:ascii="Times New Roman" w:hAnsi="Times New Roman"/>
                 <w:sz w:val="20"/>
               </w:rPr>
-              <w:t>Chạy thử nghiệm thực địa end-to-end (Voice + Visual Grounding + Handoff) và hoàn thiện Báo cáo Go/No-go.</w:t>
+              <w:t>Triển khai thử nghiệm Pilot 50 xe GreenSM thực địa tại Hà Nội (Quận Hoàn Kiếm &amp; Cầu Giấy), đo lường CSAT.</w:t>
             </w:r>
           </w:p>
         </w:tc>
@@ -4821,7 +5103,7 @@
                 <w:rFonts w:ascii="Times New Roman" w:hAnsi="Times New Roman"/>
                 <w:sz w:val="20"/>
               </w:rPr>
-              <w:t>18/10/2026</w:t>
+              <w:t>08/11/2026</w:t>
             </w:r>
           </w:p>
         </w:tc>
@@ -4846,7 +5128,7 @@
                 <w:rFonts w:ascii="Times New Roman" w:hAnsi="Times New Roman"/>
                 <w:sz w:val="20"/>
               </w:rPr>
-              <w:t>Tài liệu kỹ thuật hoàn chỉnh, Video demo thực tế và Slide trình bày chung kết.</w:t>
+              <w:t>Báo cáo nghiệm thu Pilot thực địa, dữ liệu đo lường CSAT và Slide bảo vệ chung kết.</w:t>
             </w:r>
           </w:p>
         </w:tc>
@@ -4879,7 +5161,7 @@
         <w:rPr>
           <w:rFonts w:ascii="Times New Roman" w:hAnsi="Times New Roman"/>
         </w:rPr>
-        <w:t>Phiên bản POC hiện tại của OlaSM đã chứng minh đầy đủ tính khả thi kỹ thuật, độ tin cậy của thuật toán và tiềm năng thực tiễn to lớn đối với hệ sinh thái xe điện thông minh GreenSM. Với thời gian đàm thoại rút ngắn 62%, kiến trúc chịu lỗi cao, bộ kiểm thử tự động 694 bài test xanh 100% và khả năng cá nhân hóa ưu đãi vượt trội, hệ thống sẵn sàng bước vào giai đoạn thử nghiệm Pilot.</w:t>
+        <w:t>Phiên bản POC hiện tại của OlaSM đã chứng minh trọn vẹn tính khả thi kỹ thuật vượt trội, độ tin cậy của thuật toán và tiềm năng ứng dụng thực tiễn to lớn đối với hệ sinh thái xe điện thông minh GreenSM. Bằng việc hoàn thành sớm toàn bộ các mục tiêu của Tuần 4 và Tuần 5, hệ thống đã sở hữu độ trễ phản hồi ấn tượng (TTFA P95 đạt 1.41s), thời gian đàm thoại rút ngắn 72%, độ hiệu chuẩn ECE đạt 0.0127 và bộ kiểm thử tự động 704 / 704 tests xanh tuyệt đối.</w:t>
       </w:r>
     </w:p>
     <w:p>
@@ -4890,7 +5172,7 @@
         <w:rPr>
           <w:rFonts w:ascii="Times New Roman" w:hAnsi="Times New Roman"/>
         </w:rPr>
-        <w:t>Nhóm 4 kính đề nghị Thầy Lê Duy Dũng, Anh Lê Yên Thanh và Ban Đề án xem xét: (1) Phê duyệt kết quả nghiệm thu POC Phase 3 của Nhóm 4; (2) Hỗ trợ kết nối với Ban Công nghệ GreenSM để mở quyền truy cập tài khoản GSM Sandbox API và tập dữ liệu mẫu phục vụ hoàn thiện sản phẩm.</w:t>
+        <w:t>Nhóm 4 kính đề nghị TS. Lê Duy Dũng, Anh Lê Yên Thanh và Ban Đề án xem xét: (1) Phê duyệt kết quả nghiệm thu POC của Nhóm 4; (2) Hỗ trợ kết nối chính thức với Ban Công nghệ GreenSM để mở quyền truy cập tài khoản GSM Sandbox API Live và chia sẻ dữ liệu thực tế nhằm chuẩn bị cho giai đoạn thử nghiệm Pilot thực địa tại Hà Nội.</w:t>
       </w:r>
     </w:p>
     <w:p>

</xml_diff>